<commit_message>
Update HVI into the dataset
Add HVI dataset
Clean HVI
</commit_message>
<xml_diff>
--- a/ResearchPaper.docx
+++ b/ResearchPaper.docx
@@ -879,15 +879,7 @@
           <w:sz w:val="24"/>
           <w:szCs w:val="24"/>
         </w:rPr>
-        <w:t xml:space="preserve">persistence-based features and demonstrate correlations between specific topological patterns and large wildfire </w:t>
-      </w:r>
-      <w:r>
-        <w:rPr>
-          <w:rFonts w:ascii="Times New Roman" w:eastAsia="Times New Roman" w:hAnsi="Times New Roman" w:cs="Times New Roman"/>
-          <w:sz w:val="24"/>
-          <w:szCs w:val="24"/>
-        </w:rPr>
-        <w:t>events.</w:t>
+        <w:t>persistence-based features and demonstrate correlations between specific topological patterns and large wildfire events.</w:t>
       </w:r>
       <w:r>
         <w:rPr>

</xml_diff>

<commit_message>
Update work week 12
</commit_message>
<xml_diff>
--- a/ResearchPaper.docx
+++ b/ResearchPaper.docx
@@ -10,6 +10,12 @@
       </w:pPr>
       <w:bookmarkStart w:id="0" w:name="_pzqy8dpyoduc" w:colFirst="0" w:colLast="0"/>
       <w:bookmarkEnd w:id="0"/>
+      <w:r>
+        <w:t>2</w:t>
+      </w:r>
+      <w:r>
+        <w:tab/>
+      </w:r>
     </w:p>
     <w:p>
       <w:pPr>
@@ -220,8 +226,18 @@
           <w:sz w:val="24"/>
           <w:szCs w:val="24"/>
         </w:rPr>
-        <w:t>Kristin Kurianski</w:t>
-      </w:r>
+        <w:t xml:space="preserve">Kristin </w:t>
+      </w:r>
+      <w:proofErr w:type="spellStart"/>
+      <w:r>
+        <w:rPr>
+          <w:rFonts w:ascii="Times New Roman" w:eastAsia="Times New Roman" w:hAnsi="Times New Roman" w:cs="Times New Roman"/>
+          <w:sz w:val="24"/>
+          <w:szCs w:val="24"/>
+        </w:rPr>
+        <w:t>Kurianski</w:t>
+      </w:r>
+      <w:proofErr w:type="spellEnd"/>
     </w:p>
     <w:p>
       <w:pPr>
@@ -704,8 +720,18 @@
           <w:sz w:val="24"/>
           <w:szCs w:val="24"/>
         </w:rPr>
-        <w:t>The paper "Evaluating Cooling Center Coverage Using Persistent Homology of a Filtered Witness Complex" by Erin O'Neil and Sarah Tymochko</w:t>
-      </w:r>
+        <w:t xml:space="preserve">The paper "Evaluating Cooling Center Coverage Using Persistent Homology of a Filtered Witness Complex" by Erin O'Neil and Sarah </w:t>
+      </w:r>
+      <w:proofErr w:type="spellStart"/>
+      <w:r>
+        <w:rPr>
+          <w:rFonts w:ascii="Times New Roman" w:eastAsia="Times New Roman" w:hAnsi="Times New Roman" w:cs="Times New Roman"/>
+          <w:sz w:val="24"/>
+          <w:szCs w:val="24"/>
+        </w:rPr>
+        <w:t>Tymochko</w:t>
+      </w:r>
+      <w:proofErr w:type="spellEnd"/>
       <w:r>
         <w:rPr>
           <w:rFonts w:ascii="Times New Roman" w:eastAsia="Times New Roman" w:hAnsi="Times New Roman" w:cs="Times New Roman"/>
@@ -1122,7 +1148,25 @@
           <w:sz w:val="24"/>
           <w:szCs w:val="24"/>
         </w:rPr>
-        <w:t xml:space="preserve">Our projects used datasets gathered from California Open Data website. The data is then cleaned and transformed using various Python libraries and tools such as numpy, pandas, matplotlib, … The datasets included </w:t>
+        <w:t xml:space="preserve">Our projects used datasets gathered from California Open Data website. The data is then cleaned and transformed using various Python libraries and tools such as </w:t>
+      </w:r>
+      <w:proofErr w:type="spellStart"/>
+      <w:r>
+        <w:rPr>
+          <w:rFonts w:ascii="Times New Roman" w:hAnsi="Times New Roman" w:cs="Times New Roman"/>
+          <w:sz w:val="24"/>
+          <w:szCs w:val="24"/>
+        </w:rPr>
+        <w:t>numpy</w:t>
+      </w:r>
+      <w:proofErr w:type="spellEnd"/>
+      <w:r>
+        <w:rPr>
+          <w:rFonts w:ascii="Times New Roman" w:hAnsi="Times New Roman" w:cs="Times New Roman"/>
+          <w:sz w:val="24"/>
+          <w:szCs w:val="24"/>
+        </w:rPr>
+        <w:t xml:space="preserve">, pandas, matplotlib, … The datasets included </w:t>
       </w:r>
       <w:r>
         <w:rPr>
@@ -1138,7 +1182,25 @@
           <w:sz w:val="24"/>
           <w:szCs w:val="24"/>
         </w:rPr>
-        <w:t xml:space="preserve"> Firstly, all data gathered must be converted into a common coordinate system as .geojson file. D</w:t>
+        <w:t xml:space="preserve"> Firstly, all data gathered must be converted into a common coordinate system as .</w:t>
+      </w:r>
+      <w:proofErr w:type="spellStart"/>
+      <w:r>
+        <w:rPr>
+          <w:rFonts w:ascii="Times New Roman" w:hAnsi="Times New Roman" w:cs="Times New Roman"/>
+          <w:sz w:val="24"/>
+          <w:szCs w:val="24"/>
+        </w:rPr>
+        <w:t>geojson</w:t>
+      </w:r>
+      <w:proofErr w:type="spellEnd"/>
+      <w:r>
+        <w:rPr>
+          <w:rFonts w:ascii="Times New Roman" w:hAnsi="Times New Roman" w:cs="Times New Roman"/>
+          <w:sz w:val="24"/>
+          <w:szCs w:val="24"/>
+        </w:rPr>
+        <w:t xml:space="preserve"> file. D</w:t>
       </w:r>
       <w:r>
         <w:rPr>
@@ -1191,6 +1253,332 @@
           <w:szCs w:val="24"/>
         </w:rPr>
         <w:t>Similarly, inconsistent coordinate systems could distort distance calculations, resulting in incorrect identification of coverage gaps.</w:t>
+      </w:r>
+    </w:p>
+    <w:p>
+      <w:pPr>
+        <w:spacing w:line="480" w:lineRule="auto"/>
+        <w:ind w:firstLine="720"/>
+        <w:rPr>
+          <w:rFonts w:ascii="Times New Roman" w:hAnsi="Times New Roman" w:cs="Times New Roman"/>
+          <w:sz w:val="24"/>
+          <w:szCs w:val="24"/>
+        </w:rPr>
+      </w:pPr>
+      <w:r>
+        <w:rPr>
+          <w:rFonts w:ascii="Times New Roman" w:hAnsi="Times New Roman" w:cs="Times New Roman"/>
+          <w:sz w:val="24"/>
+          <w:szCs w:val="24"/>
+        </w:rPr>
+        <w:t>The following datasets were used in this study:</w:t>
+      </w:r>
+    </w:p>
+    <w:p>
+      <w:pPr>
+        <w:pStyle w:val="ListParagraph"/>
+        <w:numPr>
+          <w:ilvl w:val="0"/>
+          <w:numId w:val="5"/>
+        </w:numPr>
+        <w:spacing w:line="480" w:lineRule="auto"/>
+        <w:rPr>
+          <w:rFonts w:ascii="Times New Roman" w:hAnsi="Times New Roman" w:cs="Times New Roman"/>
+          <w:sz w:val="24"/>
+          <w:szCs w:val="24"/>
+        </w:rPr>
+      </w:pPr>
+      <w:r>
+        <w:rPr>
+          <w:rFonts w:ascii="Times New Roman" w:hAnsi="Times New Roman" w:cs="Times New Roman"/>
+          <w:b/>
+          <w:bCs/>
+          <w:sz w:val="24"/>
+          <w:szCs w:val="24"/>
+        </w:rPr>
+        <w:t xml:space="preserve">Fire Station Locations (LAFD and LACoFD) </w:t>
+      </w:r>
+      <w:r>
+        <w:rPr>
+          <w:rFonts w:ascii="Times New Roman" w:hAnsi="Times New Roman" w:cs="Times New Roman"/>
+          <w:sz w:val="24"/>
+          <w:szCs w:val="24"/>
+        </w:rPr>
+        <w:t>— .</w:t>
+      </w:r>
+      <w:proofErr w:type="spellStart"/>
+      <w:r>
+        <w:rPr>
+          <w:rFonts w:ascii="Times New Roman" w:hAnsi="Times New Roman" w:cs="Times New Roman"/>
+          <w:sz w:val="24"/>
+          <w:szCs w:val="24"/>
+        </w:rPr>
+        <w:t>geojson</w:t>
+      </w:r>
+      <w:proofErr w:type="spellEnd"/>
+      <w:r>
+        <w:rPr>
+          <w:rFonts w:ascii="Times New Roman" w:hAnsi="Times New Roman" w:cs="Times New Roman"/>
+          <w:sz w:val="24"/>
+          <w:szCs w:val="24"/>
+        </w:rPr>
+        <w:t xml:space="preserve">: </w:t>
+      </w:r>
+      <w:r>
+        <w:rPr>
+          <w:rFonts w:ascii="Times New Roman" w:hAnsi="Times New Roman" w:cs="Times New Roman"/>
+          <w:sz w:val="24"/>
+          <w:szCs w:val="24"/>
+        </w:rPr>
+        <w:t>Each entry includes station coordinates used to assess spatial coverage and compute proximity-based features across census tracts in Los Angeles County.</w:t>
+      </w:r>
+    </w:p>
+    <w:p>
+      <w:pPr>
+        <w:pStyle w:val="ListParagraph"/>
+        <w:numPr>
+          <w:ilvl w:val="0"/>
+          <w:numId w:val="5"/>
+        </w:numPr>
+        <w:spacing w:line="480" w:lineRule="auto"/>
+        <w:rPr>
+          <w:rFonts w:ascii="Times New Roman" w:hAnsi="Times New Roman" w:cs="Times New Roman"/>
+          <w:sz w:val="24"/>
+          <w:szCs w:val="24"/>
+        </w:rPr>
+      </w:pPr>
+      <w:r>
+        <w:rPr>
+          <w:rFonts w:ascii="Times New Roman" w:hAnsi="Times New Roman" w:cs="Times New Roman"/>
+          <w:b/>
+          <w:bCs/>
+          <w:sz w:val="24"/>
+          <w:szCs w:val="24"/>
+        </w:rPr>
+        <w:t>California SVI 2022</w:t>
+      </w:r>
+      <w:r>
+        <w:rPr>
+          <w:rFonts w:ascii="Times New Roman" w:hAnsi="Times New Roman" w:cs="Times New Roman"/>
+          <w:sz w:val="24"/>
+          <w:szCs w:val="24"/>
+        </w:rPr>
+        <w:t xml:space="preserve"> &amp; </w:t>
+      </w:r>
+      <w:r>
+        <w:rPr>
+          <w:rFonts w:ascii="Times New Roman" w:hAnsi="Times New Roman" w:cs="Times New Roman"/>
+          <w:b/>
+          <w:bCs/>
+          <w:sz w:val="24"/>
+          <w:szCs w:val="24"/>
+        </w:rPr>
+        <w:t>LA Census Tract Data</w:t>
+      </w:r>
+      <w:r>
+        <w:rPr>
+          <w:rFonts w:ascii="Times New Roman" w:hAnsi="Times New Roman" w:cs="Times New Roman"/>
+          <w:sz w:val="24"/>
+          <w:szCs w:val="24"/>
+        </w:rPr>
+        <w:t xml:space="preserve"> — .csv</w:t>
+      </w:r>
+      <w:r>
+        <w:rPr>
+          <w:rFonts w:ascii="Times New Roman" w:hAnsi="Times New Roman" w:cs="Times New Roman"/>
+          <w:sz w:val="24"/>
+          <w:szCs w:val="24"/>
+        </w:rPr>
+        <w:t xml:space="preserve">: </w:t>
+      </w:r>
+      <w:r>
+        <w:rPr>
+          <w:rFonts w:ascii="Times New Roman" w:hAnsi="Times New Roman" w:cs="Times New Roman"/>
+          <w:sz w:val="24"/>
+          <w:szCs w:val="24"/>
+        </w:rPr>
+        <w:t>Tract-level socio-demographic indicators joined with LA County census geometries to identify socially vulnerable communities at disproportionate disaster risk.</w:t>
+      </w:r>
+      <w:r>
+        <w:rPr>
+          <w:rFonts w:ascii="Times New Roman" w:hAnsi="Times New Roman" w:cs="Times New Roman"/>
+          <w:sz w:val="24"/>
+          <w:szCs w:val="24"/>
+        </w:rPr>
+        <w:t xml:space="preserve"> </w:t>
+      </w:r>
+    </w:p>
+    <w:p>
+      <w:pPr>
+        <w:pStyle w:val="ListParagraph"/>
+        <w:numPr>
+          <w:ilvl w:val="0"/>
+          <w:numId w:val="5"/>
+        </w:numPr>
+        <w:spacing w:line="480" w:lineRule="auto"/>
+        <w:rPr>
+          <w:rFonts w:ascii="Times New Roman" w:hAnsi="Times New Roman" w:cs="Times New Roman"/>
+          <w:sz w:val="24"/>
+          <w:szCs w:val="24"/>
+        </w:rPr>
+      </w:pPr>
+      <w:r>
+        <w:rPr>
+          <w:rFonts w:ascii="Times New Roman" w:hAnsi="Times New Roman" w:cs="Times New Roman"/>
+          <w:b/>
+          <w:bCs/>
+          <w:sz w:val="24"/>
+          <w:szCs w:val="24"/>
+        </w:rPr>
+        <w:t>Hospital Location Dataset</w:t>
+      </w:r>
+      <w:r>
+        <w:rPr>
+          <w:rFonts w:ascii="Times New Roman" w:hAnsi="Times New Roman" w:cs="Times New Roman"/>
+          <w:sz w:val="24"/>
+          <w:szCs w:val="24"/>
+        </w:rPr>
+        <w:t xml:space="preserve"> — .</w:t>
+      </w:r>
+      <w:proofErr w:type="spellStart"/>
+      <w:r>
+        <w:rPr>
+          <w:rFonts w:ascii="Times New Roman" w:hAnsi="Times New Roman" w:cs="Times New Roman"/>
+          <w:sz w:val="24"/>
+          <w:szCs w:val="24"/>
+        </w:rPr>
+        <w:t>geojson</w:t>
+      </w:r>
+      <w:proofErr w:type="spellEnd"/>
+      <w:r>
+        <w:rPr>
+          <w:rFonts w:ascii="Times New Roman" w:hAnsi="Times New Roman" w:cs="Times New Roman"/>
+          <w:sz w:val="24"/>
+          <w:szCs w:val="24"/>
+        </w:rPr>
+        <w:t xml:space="preserve">: </w:t>
+      </w:r>
+      <w:r>
+        <w:rPr>
+          <w:rFonts w:ascii="Times New Roman" w:hAnsi="Times New Roman" w:cs="Times New Roman"/>
+          <w:sz w:val="24"/>
+          <w:szCs w:val="24"/>
+        </w:rPr>
+        <w:t>Point geometries of LA County hospitals used to compute emergency accessibility and broaden first-responder proximity analysis.</w:t>
+      </w:r>
+    </w:p>
+    <w:p>
+      <w:pPr>
+        <w:pStyle w:val="ListParagraph"/>
+        <w:numPr>
+          <w:ilvl w:val="0"/>
+          <w:numId w:val="5"/>
+        </w:numPr>
+        <w:spacing w:line="480" w:lineRule="auto"/>
+        <w:rPr>
+          <w:rFonts w:ascii="Times New Roman" w:hAnsi="Times New Roman" w:cs="Times New Roman"/>
+          <w:sz w:val="24"/>
+          <w:szCs w:val="24"/>
+        </w:rPr>
+      </w:pPr>
+      <w:r>
+        <w:rPr>
+          <w:rFonts w:ascii="Times New Roman" w:hAnsi="Times New Roman" w:cs="Times New Roman"/>
+          <w:b/>
+          <w:bCs/>
+          <w:sz w:val="24"/>
+          <w:szCs w:val="24"/>
+        </w:rPr>
+        <w:t>Fire Hydrant Locations</w:t>
+      </w:r>
+      <w:r>
+        <w:rPr>
+          <w:rFonts w:ascii="Times New Roman" w:hAnsi="Times New Roman" w:cs="Times New Roman"/>
+          <w:sz w:val="24"/>
+          <w:szCs w:val="24"/>
+        </w:rPr>
+        <w:t xml:space="preserve"> — .</w:t>
+      </w:r>
+      <w:proofErr w:type="spellStart"/>
+      <w:r>
+        <w:rPr>
+          <w:rFonts w:ascii="Times New Roman" w:hAnsi="Times New Roman" w:cs="Times New Roman"/>
+          <w:sz w:val="24"/>
+          <w:szCs w:val="24"/>
+        </w:rPr>
+        <w:t>geojson</w:t>
+      </w:r>
+      <w:proofErr w:type="spellEnd"/>
+      <w:r>
+        <w:rPr>
+          <w:rFonts w:ascii="Times New Roman" w:hAnsi="Times New Roman" w:cs="Times New Roman"/>
+          <w:sz w:val="24"/>
+          <w:szCs w:val="24"/>
+        </w:rPr>
+        <w:t xml:space="preserve">: </w:t>
+      </w:r>
+      <w:r>
+        <w:rPr>
+          <w:rFonts w:ascii="Times New Roman" w:hAnsi="Times New Roman" w:cs="Times New Roman"/>
+          <w:sz w:val="24"/>
+          <w:szCs w:val="24"/>
+        </w:rPr>
+        <w:t>P</w:t>
+      </w:r>
+      <w:r>
+        <w:rPr>
+          <w:rFonts w:ascii="Times New Roman" w:hAnsi="Times New Roman" w:cs="Times New Roman"/>
+          <w:sz w:val="24"/>
+          <w:szCs w:val="24"/>
+        </w:rPr>
+        <w:t>ositions of fire hydrants across the</w:t>
+      </w:r>
+      <w:r>
+        <w:rPr>
+          <w:rFonts w:ascii="Times New Roman" w:hAnsi="Times New Roman" w:cs="Times New Roman"/>
+          <w:sz w:val="24"/>
+          <w:szCs w:val="24"/>
+        </w:rPr>
+        <w:t xml:space="preserve"> LA county </w:t>
+      </w:r>
+      <w:r>
+        <w:rPr>
+          <w:rFonts w:ascii="Times New Roman" w:hAnsi="Times New Roman" w:cs="Times New Roman"/>
+          <w:sz w:val="24"/>
+          <w:szCs w:val="24"/>
+        </w:rPr>
+        <w:t>used to evaluate local water access</w:t>
+      </w:r>
+      <w:r>
+        <w:rPr>
+          <w:rFonts w:ascii="Times New Roman" w:hAnsi="Times New Roman" w:cs="Times New Roman"/>
+          <w:sz w:val="24"/>
+          <w:szCs w:val="24"/>
+        </w:rPr>
+        <w:t xml:space="preserve">. </w:t>
+      </w:r>
+    </w:p>
+    <w:p>
+      <w:pPr>
+        <w:pStyle w:val="ListParagraph"/>
+        <w:numPr>
+          <w:ilvl w:val="0"/>
+          <w:numId w:val="5"/>
+        </w:numPr>
+        <w:spacing w:line="480" w:lineRule="auto"/>
+        <w:rPr>
+          <w:rFonts w:ascii="Times New Roman" w:hAnsi="Times New Roman" w:cs="Times New Roman"/>
+          <w:sz w:val="24"/>
+          <w:szCs w:val="24"/>
+        </w:rPr>
+      </w:pPr>
+      <w:r>
+        <w:rPr>
+          <w:rFonts w:ascii="Times New Roman" w:hAnsi="Times New Roman" w:cs="Times New Roman"/>
+          <w:sz w:val="24"/>
+          <w:szCs w:val="24"/>
+        </w:rPr>
+        <w:t>Los Angeles County Heat Vulnerability Index (HVI) — .csv: Tract-level heat vulnerability scores used alongside the SVI to capture compounding environmental and socio-demographic risks.</w:t>
       </w:r>
     </w:p>
     <w:p>
@@ -1232,76 +1620,1456 @@
     <w:p>
       <w:pPr>
         <w:spacing w:line="480" w:lineRule="auto"/>
+        <w:ind w:left="720" w:firstLine="360"/>
+        <w:rPr>
+          <w:rStyle w:val="mord"/>
+          <w:sz w:val="24"/>
+          <w:szCs w:val="24"/>
+        </w:rPr>
+      </w:pPr>
+      <w:r>
+        <w:rPr>
+          <w:rFonts w:ascii="Times New Roman" w:hAnsi="Times New Roman" w:cs="Times New Roman"/>
+          <w:sz w:val="24"/>
+          <w:szCs w:val="24"/>
+        </w:rPr>
+        <w:t>Persistent Homology is a method in Topological Data Analysis that analyze changes of topological features across multiple spatial scales</w:t>
+      </w:r>
+      <w:r>
+        <w:rPr>
+          <w:rFonts w:ascii="Times New Roman" w:hAnsi="Times New Roman" w:cs="Times New Roman"/>
+          <w:sz w:val="24"/>
+          <w:szCs w:val="24"/>
+        </w:rPr>
+        <w:t xml:space="preserve">. </w:t>
+      </w:r>
+      <w:r>
+        <w:rPr>
+          <w:rFonts w:ascii="Times New Roman" w:hAnsi="Times New Roman" w:cs="Times New Roman"/>
+          <w:sz w:val="24"/>
+          <w:szCs w:val="24"/>
+        </w:rPr>
+        <w:t>Given a set of data points</w:t>
+      </w:r>
+      <w:r>
+        <w:rPr>
+          <w:sz w:val="24"/>
+          <w:szCs w:val="24"/>
+        </w:rPr>
+        <w:t xml:space="preserve"> </w:t>
+      </w:r>
+      <m:oMath>
+        <m:r>
+          <w:rPr>
+            <w:rFonts w:ascii="Cambria Math" w:hAnsi="Cambria Math"/>
+            <w:sz w:val="24"/>
+            <w:szCs w:val="24"/>
+          </w:rPr>
+          <m:t>X=</m:t>
+        </m:r>
+        <m:r>
+          <w:rPr>
+            <w:rFonts w:ascii="Cambria Math" w:hAnsi="Cambria Math"/>
+            <w:sz w:val="24"/>
+            <w:szCs w:val="24"/>
+          </w:rPr>
+          <w:lastRenderedPageBreak/>
+          <m:t>{</m:t>
+        </m:r>
+        <m:sSub>
+          <m:sSubPr>
+            <m:ctrlPr>
+              <w:rPr>
+                <w:rFonts w:ascii="Cambria Math" w:hAnsi="Cambria Math"/>
+                <w:sz w:val="24"/>
+                <w:szCs w:val="24"/>
+              </w:rPr>
+            </m:ctrlPr>
+          </m:sSubPr>
+          <m:e>
+            <m:r>
+              <w:rPr>
+                <w:rFonts w:ascii="Cambria Math" w:hAnsi="Cambria Math"/>
+                <w:sz w:val="24"/>
+                <w:szCs w:val="24"/>
+              </w:rPr>
+              <m:t>x</m:t>
+            </m:r>
+          </m:e>
+          <m:sub>
+            <m:r>
+              <w:rPr>
+                <w:rFonts w:ascii="Cambria Math" w:hAnsi="Cambria Math"/>
+                <w:sz w:val="24"/>
+                <w:szCs w:val="24"/>
+              </w:rPr>
+              <m:t>1</m:t>
+            </m:r>
+          </m:sub>
+        </m:sSub>
+        <m:r>
+          <w:rPr>
+            <w:rFonts w:ascii="Cambria Math" w:hAnsi="Cambria Math"/>
+            <w:sz w:val="24"/>
+            <w:szCs w:val="24"/>
+          </w:rPr>
+          <m:t>,</m:t>
+        </m:r>
+        <m:sSub>
+          <m:sSubPr>
+            <m:ctrlPr>
+              <w:rPr>
+                <w:rFonts w:ascii="Cambria Math" w:hAnsi="Cambria Math"/>
+                <w:sz w:val="24"/>
+                <w:szCs w:val="24"/>
+              </w:rPr>
+            </m:ctrlPr>
+          </m:sSubPr>
+          <m:e>
+            <m:r>
+              <w:rPr>
+                <w:rFonts w:ascii="Cambria Math" w:hAnsi="Cambria Math"/>
+                <w:sz w:val="24"/>
+                <w:szCs w:val="24"/>
+              </w:rPr>
+              <m:t>x</m:t>
+            </m:r>
+          </m:e>
+          <m:sub>
+            <m:r>
+              <w:rPr>
+                <w:rFonts w:ascii="Cambria Math" w:hAnsi="Cambria Math"/>
+                <w:sz w:val="24"/>
+                <w:szCs w:val="24"/>
+              </w:rPr>
+              <m:t>2</m:t>
+            </m:r>
+          </m:sub>
+        </m:sSub>
+        <m:r>
+          <w:rPr>
+            <w:rFonts w:ascii="Cambria Math" w:hAnsi="Cambria Math"/>
+            <w:sz w:val="24"/>
+            <w:szCs w:val="24"/>
+          </w:rPr>
+          <m:t>,…,</m:t>
+        </m:r>
+        <m:sSub>
+          <m:sSubPr>
+            <m:ctrlPr>
+              <w:rPr>
+                <w:rFonts w:ascii="Cambria Math" w:hAnsi="Cambria Math"/>
+                <w:sz w:val="24"/>
+                <w:szCs w:val="24"/>
+              </w:rPr>
+            </m:ctrlPr>
+          </m:sSubPr>
+          <m:e>
+            <m:r>
+              <w:rPr>
+                <w:rFonts w:ascii="Cambria Math" w:hAnsi="Cambria Math"/>
+                <w:sz w:val="24"/>
+                <w:szCs w:val="24"/>
+              </w:rPr>
+              <m:t>x</m:t>
+            </m:r>
+          </m:e>
+          <m:sub>
+            <m:r>
+              <w:rPr>
+                <w:rFonts w:ascii="Cambria Math" w:hAnsi="Cambria Math"/>
+                <w:sz w:val="24"/>
+                <w:szCs w:val="24"/>
+              </w:rPr>
+              <m:t>n</m:t>
+            </m:r>
+          </m:sub>
+        </m:sSub>
+        <m:r>
+          <w:rPr>
+            <w:rFonts w:ascii="Cambria Math" w:hAnsi="Cambria Math"/>
+            <w:sz w:val="24"/>
+            <w:szCs w:val="24"/>
+          </w:rPr>
+          <m:t>}⊂</m:t>
+        </m:r>
+        <m:sSup>
+          <m:sSupPr>
+            <m:ctrlPr>
+              <w:rPr>
+                <w:rFonts w:ascii="Cambria Math" w:hAnsi="Cambria Math"/>
+                <w:sz w:val="24"/>
+                <w:szCs w:val="24"/>
+              </w:rPr>
+            </m:ctrlPr>
+          </m:sSupPr>
+          <m:e>
+            <m:r>
+              <m:rPr>
+                <m:scr m:val="double-struck"/>
+                <m:sty m:val="p"/>
+              </m:rPr>
+              <w:rPr>
+                <w:rFonts w:ascii="Cambria Math" w:hAnsi="Cambria Math"/>
+                <w:sz w:val="24"/>
+                <w:szCs w:val="24"/>
+              </w:rPr>
+              <m:t>R</m:t>
+            </m:r>
+          </m:e>
+          <m:sup>
+            <m:r>
+              <w:rPr>
+                <w:rFonts w:ascii="Cambria Math" w:hAnsi="Cambria Math"/>
+                <w:sz w:val="24"/>
+                <w:szCs w:val="24"/>
+              </w:rPr>
+              <m:t>d</m:t>
+            </m:r>
+          </m:sup>
+        </m:sSup>
+      </m:oMath>
+      <w:r>
+        <w:rPr>
+          <w:sz w:val="24"/>
+          <w:szCs w:val="24"/>
+        </w:rPr>
+        <w:t xml:space="preserve">, </w:t>
+      </w:r>
+      <w:r>
+        <w:rPr>
+          <w:rFonts w:ascii="Times New Roman" w:hAnsi="Times New Roman" w:cs="Times New Roman"/>
+          <w:sz w:val="24"/>
+          <w:szCs w:val="24"/>
+        </w:rPr>
+        <w:t xml:space="preserve">we construct a </w:t>
+      </w:r>
+      <w:r>
+        <w:rPr>
+          <w:rStyle w:val="Strong"/>
+          <w:rFonts w:ascii="Times New Roman" w:hAnsi="Times New Roman" w:cs="Times New Roman"/>
+          <w:sz w:val="24"/>
+          <w:szCs w:val="24"/>
+        </w:rPr>
+        <w:t>Vietoris–Rips complex</w:t>
+      </w:r>
+      <w:r>
+        <w:rPr>
+          <w:sz w:val="24"/>
+          <w:szCs w:val="24"/>
+        </w:rPr>
+        <w:t xml:space="preserve"> </w:t>
+      </w:r>
+      <m:oMath>
+        <m:r>
+          <w:rPr>
+            <w:rFonts w:ascii="Cambria Math" w:hAnsi="Cambria Math"/>
+            <w:sz w:val="24"/>
+            <w:szCs w:val="24"/>
+          </w:rPr>
+          <m:t>VR</m:t>
+        </m:r>
+        <m:d>
+          <m:dPr>
+            <m:ctrlPr>
+              <w:rPr>
+                <w:rFonts w:ascii="Cambria Math" w:hAnsi="Cambria Math"/>
+                <w:i/>
+                <w:sz w:val="24"/>
+                <w:szCs w:val="24"/>
+              </w:rPr>
+            </m:ctrlPr>
+          </m:dPr>
+          <m:e>
+            <m:r>
+              <w:rPr>
+                <w:rFonts w:ascii="Cambria Math" w:hAnsi="Cambria Math"/>
+                <w:sz w:val="24"/>
+                <w:szCs w:val="24"/>
+              </w:rPr>
+              <m:t>X,ϵ</m:t>
+            </m:r>
+          </m:e>
+        </m:d>
+      </m:oMath>
+      <w:r>
+        <w:rPr>
+          <w:sz w:val="24"/>
+          <w:szCs w:val="24"/>
+        </w:rPr>
+        <w:t xml:space="preserve"> </w:t>
+      </w:r>
+      <w:r>
+        <w:rPr>
+          <w:rFonts w:ascii="Times New Roman" w:hAnsi="Times New Roman" w:cs="Times New Roman"/>
+          <w:sz w:val="24"/>
+          <w:szCs w:val="24"/>
+        </w:rPr>
+        <w:t xml:space="preserve">by connecting points </w:t>
+      </w:r>
+      <w:r>
+        <w:rPr>
+          <w:rFonts w:ascii="Times New Roman" w:hAnsi="Times New Roman" w:cs="Times New Roman"/>
+          <w:sz w:val="24"/>
+          <w:szCs w:val="24"/>
+        </w:rPr>
+        <w:t xml:space="preserve"> </w:t>
+      </w:r>
+      <w:r>
+        <w:rPr>
+          <w:rFonts w:ascii="Times New Roman" w:hAnsi="Times New Roman" w:cs="Times New Roman"/>
+          <w:sz w:val="24"/>
+          <w:szCs w:val="24"/>
+        </w:rPr>
+        <w:t>within a specified distance threshold</w:t>
+      </w:r>
+      <w:r>
+        <w:rPr>
+          <w:sz w:val="24"/>
+          <w:szCs w:val="24"/>
+        </w:rPr>
+        <w:t xml:space="preserve"> </w:t>
+      </w:r>
+      <m:oMath>
+        <m:r>
+          <w:rPr>
+            <w:rFonts w:ascii="Cambria Math" w:hAnsi="Cambria Math"/>
+            <w:sz w:val="24"/>
+            <w:szCs w:val="24"/>
+          </w:rPr>
+          <m:t>ϵ</m:t>
+        </m:r>
+      </m:oMath>
+      <w:r>
+        <w:rPr>
+          <w:sz w:val="24"/>
+          <w:szCs w:val="24"/>
+        </w:rPr>
+        <w:t xml:space="preserve">, </w:t>
+      </w:r>
+      <w:r>
+        <w:rPr>
+          <w:rFonts w:ascii="Times New Roman" w:hAnsi="Times New Roman" w:cs="Times New Roman"/>
+          <w:sz w:val="24"/>
+          <w:szCs w:val="24"/>
+        </w:rPr>
+        <w:t>where an edge</w:t>
+      </w:r>
+      <w:r>
+        <w:rPr>
+          <w:sz w:val="24"/>
+          <w:szCs w:val="24"/>
+        </w:rPr>
+        <w:t xml:space="preserve"> </w:t>
+      </w:r>
+      <m:oMath>
+        <m:d>
+          <m:dPr>
+            <m:sepChr m:val=","/>
+            <m:ctrlPr>
+              <w:rPr>
+                <w:rFonts w:ascii="Cambria Math" w:hAnsi="Cambria Math"/>
+                <w:sz w:val="24"/>
+                <w:szCs w:val="24"/>
+              </w:rPr>
+            </m:ctrlPr>
+          </m:dPr>
+          <m:e>
+            <m:sSub>
+              <m:sSubPr>
+                <m:ctrlPr>
+                  <w:rPr>
+                    <w:rFonts w:ascii="Cambria Math" w:hAnsi="Cambria Math"/>
+                    <w:sz w:val="24"/>
+                    <w:szCs w:val="24"/>
+                  </w:rPr>
+                </m:ctrlPr>
+              </m:sSubPr>
+              <m:e>
+                <m:r>
+                  <w:rPr>
+                    <w:rFonts w:ascii="Cambria Math" w:hAnsi="Cambria Math"/>
+                    <w:sz w:val="24"/>
+                    <w:szCs w:val="24"/>
+                  </w:rPr>
+                  <m:t>x</m:t>
+                </m:r>
+              </m:e>
+              <m:sub>
+                <m:r>
+                  <w:rPr>
+                    <w:rFonts w:ascii="Cambria Math" w:hAnsi="Cambria Math"/>
+                    <w:sz w:val="24"/>
+                    <w:szCs w:val="24"/>
+                  </w:rPr>
+                  <m:t>i</m:t>
+                </m:r>
+              </m:sub>
+            </m:sSub>
+          </m:e>
+          <m:e>
+            <m:sSub>
+              <m:sSubPr>
+                <m:ctrlPr>
+                  <w:rPr>
+                    <w:rFonts w:ascii="Cambria Math" w:hAnsi="Cambria Math"/>
+                    <w:sz w:val="24"/>
+                    <w:szCs w:val="24"/>
+                  </w:rPr>
+                </m:ctrlPr>
+              </m:sSubPr>
+              <m:e>
+                <m:r>
+                  <w:rPr>
+                    <w:rFonts w:ascii="Cambria Math" w:hAnsi="Cambria Math"/>
+                    <w:sz w:val="24"/>
+                    <w:szCs w:val="24"/>
+                  </w:rPr>
+                  <m:t>x</m:t>
+                </m:r>
+              </m:e>
+              <m:sub>
+                <m:r>
+                  <w:rPr>
+                    <w:rFonts w:ascii="Cambria Math" w:hAnsi="Cambria Math"/>
+                    <w:sz w:val="24"/>
+                    <w:szCs w:val="24"/>
+                  </w:rPr>
+                  <m:t>j</m:t>
+                </m:r>
+              </m:sub>
+            </m:sSub>
+          </m:e>
+        </m:d>
+      </m:oMath>
+      <w:r>
+        <w:rPr>
+          <w:sz w:val="24"/>
+          <w:szCs w:val="24"/>
+        </w:rPr>
+        <w:t xml:space="preserve"> </w:t>
+      </w:r>
+      <w:r>
+        <w:rPr>
+          <w:rFonts w:ascii="Times New Roman" w:hAnsi="Times New Roman" w:cs="Times New Roman"/>
+          <w:sz w:val="24"/>
+          <w:szCs w:val="24"/>
+        </w:rPr>
+        <w:t xml:space="preserve">is </w:t>
+      </w:r>
+      <w:r>
+        <w:rPr>
+          <w:rFonts w:ascii="Times New Roman" w:hAnsi="Times New Roman" w:cs="Times New Roman"/>
+          <w:sz w:val="24"/>
+          <w:szCs w:val="24"/>
+        </w:rPr>
+        <w:t>included if</w:t>
+      </w:r>
+      <w:r>
+        <w:rPr>
+          <w:sz w:val="24"/>
+          <w:szCs w:val="24"/>
+        </w:rPr>
+        <w:t xml:space="preserve"> </w:t>
+      </w:r>
+      <m:oMath>
+        <m:r>
+          <w:rPr>
+            <w:rFonts w:ascii="Cambria Math" w:hAnsi="Cambria Math"/>
+            <w:sz w:val="24"/>
+            <w:szCs w:val="24"/>
+          </w:rPr>
+          <m:t>d(</m:t>
+        </m:r>
+        <m:sSub>
+          <m:sSubPr>
+            <m:ctrlPr>
+              <w:rPr>
+                <w:rFonts w:ascii="Cambria Math" w:hAnsi="Cambria Math"/>
+                <w:sz w:val="24"/>
+                <w:szCs w:val="24"/>
+              </w:rPr>
+            </m:ctrlPr>
+          </m:sSubPr>
+          <m:e>
+            <m:r>
+              <w:rPr>
+                <w:rFonts w:ascii="Cambria Math" w:hAnsi="Cambria Math"/>
+                <w:sz w:val="24"/>
+                <w:szCs w:val="24"/>
+              </w:rPr>
+              <m:t>x</m:t>
+            </m:r>
+          </m:e>
+          <m:sub>
+            <m:r>
+              <w:rPr>
+                <w:rFonts w:ascii="Cambria Math" w:hAnsi="Cambria Math"/>
+                <w:sz w:val="24"/>
+                <w:szCs w:val="24"/>
+              </w:rPr>
+              <m:t>i</m:t>
+            </m:r>
+          </m:sub>
+        </m:sSub>
+        <m:r>
+          <w:rPr>
+            <w:rFonts w:ascii="Cambria Math" w:hAnsi="Cambria Math"/>
+            <w:sz w:val="24"/>
+            <w:szCs w:val="24"/>
+          </w:rPr>
+          <m:t>,</m:t>
+        </m:r>
+        <m:sSub>
+          <m:sSubPr>
+            <m:ctrlPr>
+              <w:rPr>
+                <w:rFonts w:ascii="Cambria Math" w:hAnsi="Cambria Math"/>
+                <w:sz w:val="24"/>
+                <w:szCs w:val="24"/>
+              </w:rPr>
+            </m:ctrlPr>
+          </m:sSubPr>
+          <m:e>
+            <m:r>
+              <w:rPr>
+                <w:rFonts w:ascii="Cambria Math" w:hAnsi="Cambria Math"/>
+                <w:sz w:val="24"/>
+                <w:szCs w:val="24"/>
+              </w:rPr>
+              <m:t>x</m:t>
+            </m:r>
+          </m:e>
+          <m:sub>
+            <m:r>
+              <w:rPr>
+                <w:rFonts w:ascii="Cambria Math" w:hAnsi="Cambria Math"/>
+                <w:sz w:val="24"/>
+                <w:szCs w:val="24"/>
+              </w:rPr>
+              <m:t>j</m:t>
+            </m:r>
+          </m:sub>
+        </m:sSub>
+        <m:r>
+          <w:rPr>
+            <w:rFonts w:ascii="Cambria Math" w:hAnsi="Cambria Math"/>
+            <w:sz w:val="24"/>
+            <w:szCs w:val="24"/>
+          </w:rPr>
+          <m:t>)≤ϵ</m:t>
+        </m:r>
+      </m:oMath>
+      <w:r>
+        <w:rPr>
+          <w:sz w:val="24"/>
+          <w:szCs w:val="24"/>
+        </w:rPr>
+        <w:t xml:space="preserve">. </w:t>
+      </w:r>
+      <w:r>
+        <w:rPr>
+          <w:rFonts w:ascii="Times New Roman" w:hAnsi="Times New Roman" w:cs="Times New Roman"/>
+          <w:sz w:val="24"/>
+          <w:szCs w:val="24"/>
+        </w:rPr>
+        <w:t>As</w:t>
+      </w:r>
+      <w:r>
+        <w:rPr>
+          <w:sz w:val="24"/>
+          <w:szCs w:val="24"/>
+        </w:rPr>
+        <w:t xml:space="preserve"> </w:t>
+      </w:r>
+      <m:oMath>
+        <m:r>
+          <w:rPr>
+            <w:rFonts w:ascii="Cambria Math" w:hAnsi="Cambria Math"/>
+            <w:sz w:val="24"/>
+            <w:szCs w:val="24"/>
+          </w:rPr>
+          <m:t>ϵ</m:t>
+        </m:r>
+        <m:r>
+          <w:rPr>
+            <w:rFonts w:ascii="Cambria Math" w:hAnsi="Cambria Math"/>
+            <w:sz w:val="24"/>
+            <w:szCs w:val="24"/>
+          </w:rPr>
+          <m:t xml:space="preserve"> </m:t>
+        </m:r>
+      </m:oMath>
+      <w:r>
+        <w:rPr>
+          <w:rFonts w:ascii="Times New Roman" w:hAnsi="Times New Roman" w:cs="Times New Roman"/>
+          <w:sz w:val="24"/>
+          <w:szCs w:val="24"/>
+        </w:rPr>
+        <w:t>i</w:t>
+      </w:r>
+      <w:r>
+        <w:rPr>
+          <w:rFonts w:ascii="Times New Roman" w:hAnsi="Times New Roman" w:cs="Times New Roman"/>
+          <w:sz w:val="24"/>
+          <w:szCs w:val="24"/>
+        </w:rPr>
+        <w:t>nc</w:t>
+      </w:r>
+      <w:r>
+        <w:rPr>
+          <w:rFonts w:ascii="Times New Roman" w:hAnsi="Times New Roman" w:cs="Times New Roman"/>
+          <w:sz w:val="24"/>
+          <w:szCs w:val="24"/>
+        </w:rPr>
+        <w:t>r</w:t>
+      </w:r>
+      <w:r>
+        <w:rPr>
+          <w:rFonts w:ascii="Times New Roman" w:hAnsi="Times New Roman" w:cs="Times New Roman"/>
+          <w:sz w:val="24"/>
+          <w:szCs w:val="24"/>
+        </w:rPr>
+        <w:t xml:space="preserve">eases, we obtain a nested sequence of simplicial complexes called a </w:t>
+      </w:r>
+      <w:r>
+        <w:rPr>
+          <w:rStyle w:val="Strong"/>
+          <w:rFonts w:ascii="Times New Roman" w:hAnsi="Times New Roman" w:cs="Times New Roman"/>
+          <w:sz w:val="24"/>
+          <w:szCs w:val="24"/>
+        </w:rPr>
+        <w:t>filtration</w:t>
+      </w:r>
+      <w:r>
+        <w:rPr>
+          <w:rFonts w:ascii="Times New Roman" w:hAnsi="Times New Roman" w:cs="Times New Roman"/>
+          <w:sz w:val="24"/>
+          <w:szCs w:val="24"/>
+        </w:rPr>
+        <w:t>:</w:t>
+      </w:r>
+    </w:p>
+    <w:p>
+      <w:pPr>
+        <w:spacing w:line="480" w:lineRule="auto"/>
         <w:ind w:left="720"/>
         <w:rPr>
-          <w:rFonts w:ascii="Times New Roman" w:hAnsi="Times New Roman" w:cs="Times New Roman"/>
-          <w:sz w:val="24"/>
-          <w:szCs w:val="24"/>
-        </w:rPr>
-      </w:pPr>
-      <w:r>
-        <w:rPr>
-          <w:rFonts w:ascii="Times New Roman" w:hAnsi="Times New Roman" w:cs="Times New Roman"/>
-          <w:sz w:val="24"/>
-          <w:szCs w:val="24"/>
-        </w:rPr>
-        <w:t xml:space="preserve">Persistent Homology is a method in Topological Data Analysis that analyze changes </w:t>
-      </w:r>
-      <w:r>
-        <w:rPr>
-          <w:rFonts w:ascii="Times New Roman" w:hAnsi="Times New Roman" w:cs="Times New Roman"/>
-          <w:sz w:val="24"/>
-          <w:szCs w:val="24"/>
-        </w:rPr>
-        <w:t>of topological features across multiple spatial scales</w:t>
-      </w:r>
-      <w:r>
-        <w:rPr>
-          <w:rFonts w:ascii="Times New Roman" w:hAnsi="Times New Roman" w:cs="Times New Roman"/>
-          <w:sz w:val="24"/>
-          <w:szCs w:val="24"/>
-        </w:rPr>
-        <w:t xml:space="preserve">. Given a set of datapoints, we can use the </w:t>
-      </w:r>
-      <w:r>
-        <w:rPr>
-          <w:rFonts w:ascii="Times New Roman" w:hAnsi="Times New Roman" w:cs="Times New Roman"/>
-          <w:sz w:val="24"/>
-          <w:szCs w:val="24"/>
-        </w:rPr>
-        <w:t>Vietoris–Rips complex</w:t>
-      </w:r>
-      <w:r>
-        <w:rPr>
-          <w:rFonts w:ascii="Times New Roman" w:hAnsi="Times New Roman" w:cs="Times New Roman"/>
-          <w:sz w:val="24"/>
-          <w:szCs w:val="24"/>
-        </w:rPr>
-        <w:t xml:space="preserve"> to connect points t</w:t>
-      </w:r>
-      <w:r>
-        <w:rPr>
-          <w:rFonts w:ascii="Times New Roman" w:hAnsi="Times New Roman" w:cs="Times New Roman"/>
-          <w:sz w:val="24"/>
-          <w:szCs w:val="24"/>
-        </w:rPr>
-        <w:t>hat are within a specified distance</w:t>
-      </w:r>
-      <w:r>
-        <w:rPr>
-          <w:rFonts w:ascii="Times New Roman" w:hAnsi="Times New Roman" w:cs="Times New Roman"/>
-          <w:sz w:val="24"/>
-          <w:szCs w:val="24"/>
-        </w:rPr>
-        <w:t>. As this distance grows and</w:t>
-      </w:r>
-      <w:r>
-        <w:rPr>
-          <w:rFonts w:ascii="Times New Roman" w:hAnsi="Times New Roman" w:cs="Times New Roman"/>
-          <w:sz w:val="24"/>
-          <w:szCs w:val="24"/>
-        </w:rPr>
-        <w:t xml:space="preserve"> topological features such as connected components (0-dimensional features), loops or holes (1-dimensional features), and higher-dimensional voids emerge and disappear.</w:t>
+          <w:rStyle w:val="mord"/>
+          <w:sz w:val="24"/>
+          <w:szCs w:val="24"/>
+        </w:rPr>
+      </w:pPr>
+      <m:oMathPara>
+        <m:oMath>
+          <m:r>
+            <m:rPr>
+              <m:sty m:val="p"/>
+            </m:rPr>
+            <w:rPr>
+              <w:rStyle w:val="mord"/>
+              <w:rFonts w:ascii="Cambria Math" w:hAnsi="Cambria Math" w:cs="Cambria Math"/>
+              <w:sz w:val="24"/>
+              <w:szCs w:val="24"/>
+            </w:rPr>
+            <m:t>∅</m:t>
+          </m:r>
+          <m:r>
+            <w:rPr>
+              <w:rStyle w:val="mrel"/>
+              <w:rFonts w:ascii="Cambria Math" w:hAnsi="Cambria Math"/>
+              <w:sz w:val="24"/>
+              <w:szCs w:val="24"/>
+            </w:rPr>
+            <m:t>=</m:t>
+          </m:r>
+          <m:r>
+            <m:rPr>
+              <m:sty m:val="p"/>
+            </m:rPr>
+            <w:rPr>
+              <w:rStyle w:val="mord"/>
+              <w:rFonts w:ascii="Cambria Math" w:hAnsi="Cambria Math"/>
+              <w:sz w:val="24"/>
+              <w:szCs w:val="24"/>
+            </w:rPr>
+            <m:t>K0</m:t>
+          </m:r>
+          <m:r>
+            <m:rPr>
+              <m:sty m:val="p"/>
+            </m:rPr>
+            <w:rPr>
+              <w:rStyle w:val="vlist-s"/>
+              <w:rFonts w:ascii="Cambria Math" w:hAnsi="Cambria Math"/>
+              <w:sz w:val="24"/>
+              <w:szCs w:val="24"/>
+            </w:rPr>
+            <m:t>​</m:t>
+          </m:r>
+          <m:r>
+            <w:rPr>
+              <w:rStyle w:val="mrel"/>
+              <w:rFonts w:ascii="Cambria Math" w:hAnsi="Cambria Math" w:cs="Cambria Math"/>
+              <w:sz w:val="24"/>
+              <w:szCs w:val="24"/>
+            </w:rPr>
+            <m:t>⊆</m:t>
+          </m:r>
+          <m:r>
+            <m:rPr>
+              <m:sty m:val="p"/>
+            </m:rPr>
+            <w:rPr>
+              <w:rStyle w:val="mord"/>
+              <w:rFonts w:ascii="Cambria Math" w:hAnsi="Cambria Math"/>
+              <w:sz w:val="24"/>
+              <w:szCs w:val="24"/>
+            </w:rPr>
+            <m:t>K1</m:t>
+          </m:r>
+          <m:r>
+            <m:rPr>
+              <m:sty m:val="p"/>
+            </m:rPr>
+            <w:rPr>
+              <w:rStyle w:val="vlist-s"/>
+              <w:rFonts w:ascii="Cambria Math" w:hAnsi="Cambria Math"/>
+              <w:sz w:val="24"/>
+              <w:szCs w:val="24"/>
+            </w:rPr>
+            <m:t>​</m:t>
+          </m:r>
+          <m:r>
+            <w:rPr>
+              <w:rStyle w:val="mrel"/>
+              <w:rFonts w:ascii="Cambria Math" w:hAnsi="Cambria Math" w:cs="Cambria Math"/>
+              <w:sz w:val="24"/>
+              <w:szCs w:val="24"/>
+            </w:rPr>
+            <m:t>⊆</m:t>
+          </m:r>
+          <m:r>
+            <m:rPr>
+              <m:sty m:val="p"/>
+            </m:rPr>
+            <w:rPr>
+              <w:rStyle w:val="mord"/>
+              <w:rFonts w:ascii="Cambria Math" w:hAnsi="Cambria Math"/>
+              <w:sz w:val="24"/>
+              <w:szCs w:val="24"/>
+            </w:rPr>
+            <m:t>K2</m:t>
+          </m:r>
+          <m:r>
+            <m:rPr>
+              <m:sty m:val="p"/>
+            </m:rPr>
+            <w:rPr>
+              <w:rStyle w:val="vlist-s"/>
+              <w:rFonts w:ascii="Cambria Math" w:hAnsi="Cambria Math"/>
+              <w:sz w:val="24"/>
+              <w:szCs w:val="24"/>
+            </w:rPr>
+            <m:t>​</m:t>
+          </m:r>
+          <m:r>
+            <w:rPr>
+              <w:rStyle w:val="mrel"/>
+              <w:rFonts w:ascii="Cambria Math" w:hAnsi="Cambria Math" w:cs="Cambria Math"/>
+              <w:sz w:val="24"/>
+              <w:szCs w:val="24"/>
+            </w:rPr>
+            <m:t>⊆</m:t>
+          </m:r>
+          <m:r>
+            <m:rPr>
+              <m:sty m:val="p"/>
+            </m:rPr>
+            <w:rPr>
+              <w:rStyle w:val="minner"/>
+              <w:rFonts w:ascii="Cambria Math" w:hAnsi="Cambria Math" w:cs="Cambria Math"/>
+              <w:sz w:val="24"/>
+              <w:szCs w:val="24"/>
+            </w:rPr>
+            <m:t>⋯</m:t>
+          </m:r>
+          <m:r>
+            <w:rPr>
+              <w:rStyle w:val="mrel"/>
+              <w:rFonts w:ascii="Cambria Math" w:hAnsi="Cambria Math" w:cs="Cambria Math"/>
+              <w:sz w:val="24"/>
+              <w:szCs w:val="24"/>
+            </w:rPr>
+            <m:t>⊆</m:t>
+          </m:r>
+          <m:r>
+            <m:rPr>
+              <m:sty m:val="p"/>
+            </m:rPr>
+            <w:rPr>
+              <w:rStyle w:val="mord"/>
+              <w:rFonts w:ascii="Cambria Math" w:hAnsi="Cambria Math"/>
+              <w:sz w:val="24"/>
+              <w:szCs w:val="24"/>
+            </w:rPr>
+            <m:t xml:space="preserve">Kn </m:t>
+          </m:r>
+        </m:oMath>
+      </m:oMathPara>
+    </w:p>
+    <w:p>
+      <w:pPr>
+        <w:spacing w:line="480" w:lineRule="auto"/>
+        <w:ind w:left="720" w:firstLine="360"/>
+        <w:rPr>
+          <w:rFonts w:ascii="Times New Roman" w:hAnsi="Times New Roman" w:cs="Times New Roman"/>
+          <w:sz w:val="24"/>
+          <w:szCs w:val="24"/>
+        </w:rPr>
+      </w:pPr>
+      <w:r>
+        <w:rPr>
+          <w:rFonts w:ascii="Times New Roman" w:hAnsi="Times New Roman" w:cs="Times New Roman"/>
+          <w:sz w:val="24"/>
+          <w:szCs w:val="24"/>
+        </w:rPr>
+        <w:t xml:space="preserve">However, the Vietoris–Rips complex </w:t>
+      </w:r>
+      <w:r>
+        <w:rPr>
+          <w:rFonts w:ascii="Times New Roman" w:hAnsi="Times New Roman" w:cs="Times New Roman"/>
+          <w:sz w:val="24"/>
+          <w:szCs w:val="24"/>
+        </w:rPr>
+        <w:t xml:space="preserve">is not optimal for large datasets. We turned to </w:t>
+      </w:r>
+      <w:r>
+        <w:rPr>
+          <w:rFonts w:ascii="Times New Roman" w:hAnsi="Times New Roman" w:cs="Times New Roman"/>
+          <w:b/>
+          <w:bCs/>
+          <w:sz w:val="24"/>
+          <w:szCs w:val="24"/>
+        </w:rPr>
+        <w:t>W</w:t>
+      </w:r>
+      <w:r>
+        <w:rPr>
+          <w:rStyle w:val="Strong"/>
+          <w:rFonts w:ascii="Times New Roman" w:hAnsi="Times New Roman" w:cs="Times New Roman"/>
+          <w:sz w:val="24"/>
+          <w:szCs w:val="24"/>
+        </w:rPr>
+        <w:t>itness Complex</w:t>
+      </w:r>
+      <w:r>
+        <w:rPr>
+          <w:sz w:val="24"/>
+          <w:szCs w:val="24"/>
+        </w:rPr>
+        <w:t xml:space="preserve"> </w:t>
+      </w:r>
+      <m:oMath>
+        <m:r>
+          <w:rPr>
+            <w:rFonts w:ascii="Cambria Math" w:hAnsi="Cambria Math"/>
+            <w:sz w:val="24"/>
+            <w:szCs w:val="24"/>
+          </w:rPr>
+          <m:t>W(L,X,ϵ)</m:t>
+        </m:r>
+      </m:oMath>
+      <w:r>
+        <w:rPr>
+          <w:sz w:val="24"/>
+          <w:szCs w:val="24"/>
+        </w:rPr>
+        <w:t xml:space="preserve">, </w:t>
+      </w:r>
+      <w:r>
+        <w:rPr>
+          <w:rFonts w:ascii="Times New Roman" w:hAnsi="Times New Roman" w:cs="Times New Roman"/>
+          <w:sz w:val="24"/>
+          <w:szCs w:val="24"/>
+        </w:rPr>
+        <w:t xml:space="preserve">which uses a small set of </w:t>
+      </w:r>
+      <w:r>
+        <w:rPr>
+          <w:rStyle w:val="Strong"/>
+          <w:rFonts w:ascii="Times New Roman" w:hAnsi="Times New Roman" w:cs="Times New Roman"/>
+          <w:sz w:val="24"/>
+          <w:szCs w:val="24"/>
+        </w:rPr>
+        <w:t>landmarks</w:t>
+      </w:r>
+      <w:r>
+        <w:rPr>
+          <w:rFonts w:ascii="Times New Roman" w:hAnsi="Times New Roman" w:cs="Times New Roman"/>
+          <w:sz w:val="24"/>
+          <w:szCs w:val="24"/>
+        </w:rPr>
+        <w:t xml:space="preserve"> </w:t>
+      </w:r>
+      <m:oMath>
+        <m:r>
+          <w:rPr>
+            <w:rFonts w:ascii="Cambria Math" w:hAnsi="Cambria Math" w:cs="Times New Roman"/>
+            <w:sz w:val="24"/>
+            <w:szCs w:val="24"/>
+          </w:rPr>
+          <m:t>L</m:t>
+        </m:r>
+      </m:oMath>
+      <w:r>
+        <w:rPr>
+          <w:rFonts w:ascii="Times New Roman" w:hAnsi="Times New Roman" w:cs="Times New Roman"/>
+          <w:sz w:val="24"/>
+          <w:szCs w:val="24"/>
+        </w:rPr>
+        <w:t xml:space="preserve"> an</w:t>
+      </w:r>
+      <w:r>
+        <w:rPr>
+          <w:rFonts w:ascii="Times New Roman" w:hAnsi="Times New Roman" w:cs="Times New Roman"/>
+          <w:sz w:val="24"/>
+          <w:szCs w:val="24"/>
+        </w:rPr>
+        <w:t xml:space="preserve">d a larger set of </w:t>
+      </w:r>
+      <w:r>
+        <w:rPr>
+          <w:rStyle w:val="Strong"/>
+          <w:rFonts w:ascii="Times New Roman" w:hAnsi="Times New Roman" w:cs="Times New Roman"/>
+          <w:sz w:val="24"/>
+          <w:szCs w:val="24"/>
+        </w:rPr>
+        <w:t>witnesses</w:t>
+      </w:r>
+      <w:r>
+        <w:rPr>
+          <w:sz w:val="24"/>
+          <w:szCs w:val="24"/>
+        </w:rPr>
+        <w:t xml:space="preserve"> </w:t>
+      </w:r>
+      <m:oMath>
+        <m:r>
+          <w:rPr>
+            <w:rFonts w:ascii="Cambria Math" w:hAnsi="Cambria Math"/>
+            <w:sz w:val="24"/>
+            <w:szCs w:val="24"/>
+          </w:rPr>
+          <m:t>X</m:t>
+        </m:r>
+      </m:oMath>
+      <w:r>
+        <w:rPr>
+          <w:sz w:val="24"/>
+          <w:szCs w:val="24"/>
+        </w:rPr>
+        <w:t xml:space="preserve">. </w:t>
+      </w:r>
+      <w:r>
+        <w:rPr>
+          <w:rFonts w:ascii="Times New Roman" w:hAnsi="Times New Roman" w:cs="Times New Roman"/>
+          <w:sz w:val="24"/>
+          <w:szCs w:val="24"/>
+        </w:rPr>
+        <w:t>C</w:t>
+      </w:r>
+      <w:r>
+        <w:rPr>
+          <w:rFonts w:ascii="Times New Roman" w:hAnsi="Times New Roman" w:cs="Times New Roman"/>
+          <w:sz w:val="24"/>
+          <w:szCs w:val="24"/>
+        </w:rPr>
+        <w:t>ensus tract centroids serve as witnesses and fire station or hospital locations serve as landmarks. This reduces the number of simplices while preserving the essential topological structure of the data.</w:t>
+      </w:r>
+    </w:p>
+    <w:p>
+      <w:pPr>
+        <w:spacing w:line="480" w:lineRule="auto"/>
+        <w:ind w:left="720" w:firstLine="360"/>
+        <w:rPr>
+          <w:sz w:val="24"/>
+          <w:szCs w:val="24"/>
+        </w:rPr>
+      </w:pPr>
+      <w:r>
+        <w:rPr>
+          <w:rFonts w:ascii="Times New Roman" w:hAnsi="Times New Roman" w:cs="Times New Roman"/>
+          <w:sz w:val="24"/>
+          <w:szCs w:val="24"/>
+        </w:rPr>
+        <w:t xml:space="preserve">The topological structure is characterized by </w:t>
+      </w:r>
+      <w:r>
+        <w:rPr>
+          <w:rStyle w:val="Strong"/>
+          <w:rFonts w:ascii="Times New Roman" w:hAnsi="Times New Roman" w:cs="Times New Roman"/>
+          <w:sz w:val="24"/>
+          <w:szCs w:val="24"/>
+        </w:rPr>
+        <w:t>Betti numbers</w:t>
+      </w:r>
+      <w:r>
+        <w:rPr>
+          <w:sz w:val="24"/>
+          <w:szCs w:val="24"/>
+        </w:rPr>
+        <w:t xml:space="preserve"> </w:t>
+      </w:r>
+      <m:oMath>
+        <m:sSub>
+          <m:sSubPr>
+            <m:ctrlPr>
+              <w:rPr>
+                <w:rFonts w:ascii="Cambria Math" w:hAnsi="Cambria Math"/>
+                <w:sz w:val="24"/>
+                <w:szCs w:val="24"/>
+              </w:rPr>
+            </m:ctrlPr>
+          </m:sSubPr>
+          <m:e>
+            <m:r>
+              <w:rPr>
+                <w:rFonts w:ascii="Cambria Math" w:hAnsi="Cambria Math"/>
+                <w:sz w:val="24"/>
+                <w:szCs w:val="24"/>
+              </w:rPr>
+              <m:t>β</m:t>
+            </m:r>
+          </m:e>
+          <m:sub>
+            <m:r>
+              <w:rPr>
+                <w:rFonts w:ascii="Cambria Math" w:hAnsi="Cambria Math"/>
+                <w:sz w:val="24"/>
+                <w:szCs w:val="24"/>
+              </w:rPr>
+              <m:t>k</m:t>
+            </m:r>
+          </m:sub>
+        </m:sSub>
+      </m:oMath>
+      <w:r>
+        <w:rPr>
+          <w:sz w:val="24"/>
+          <w:szCs w:val="24"/>
+        </w:rPr>
+        <w:t xml:space="preserve">, </w:t>
+      </w:r>
+      <w:r>
+        <w:rPr>
+          <w:rFonts w:ascii="Times New Roman" w:hAnsi="Times New Roman" w:cs="Times New Roman"/>
+          <w:sz w:val="24"/>
+          <w:szCs w:val="24"/>
+        </w:rPr>
+        <w:t>where</w:t>
+      </w:r>
+      <w:r>
+        <w:rPr>
+          <w:sz w:val="24"/>
+          <w:szCs w:val="24"/>
+        </w:rPr>
+        <w:t xml:space="preserve"> </w:t>
+      </w:r>
+      <m:oMath>
+        <m:sSub>
+          <m:sSubPr>
+            <m:ctrlPr>
+              <w:rPr>
+                <w:rFonts w:ascii="Cambria Math" w:hAnsi="Cambria Math"/>
+                <w:sz w:val="24"/>
+                <w:szCs w:val="24"/>
+              </w:rPr>
+            </m:ctrlPr>
+          </m:sSubPr>
+          <m:e>
+            <m:r>
+              <w:rPr>
+                <w:rFonts w:ascii="Cambria Math" w:hAnsi="Cambria Math"/>
+                <w:sz w:val="24"/>
+                <w:szCs w:val="24"/>
+              </w:rPr>
+              <m:t>β</m:t>
+            </m:r>
+          </m:e>
+          <m:sub>
+            <m:r>
+              <w:rPr>
+                <w:rFonts w:ascii="Cambria Math" w:hAnsi="Cambria Math"/>
+                <w:sz w:val="24"/>
+                <w:szCs w:val="24"/>
+              </w:rPr>
+              <m:t>0</m:t>
+            </m:r>
+          </m:sub>
+        </m:sSub>
+      </m:oMath>
+      <w:r>
+        <w:rPr>
+          <w:rFonts w:ascii="Times New Roman" w:hAnsi="Times New Roman" w:cs="Times New Roman"/>
+          <w:sz w:val="24"/>
+          <w:szCs w:val="24"/>
+        </w:rPr>
+        <w:t xml:space="preserve"> cou</w:t>
+      </w:r>
+      <w:r>
+        <w:rPr>
+          <w:rFonts w:ascii="Times New Roman" w:hAnsi="Times New Roman" w:cs="Times New Roman"/>
+          <w:sz w:val="24"/>
+          <w:szCs w:val="24"/>
+        </w:rPr>
+        <w:t>nts connected components,</w:t>
+      </w:r>
+      <w:r>
+        <w:rPr>
+          <w:sz w:val="24"/>
+          <w:szCs w:val="24"/>
+        </w:rPr>
+        <w:t xml:space="preserve"> </w:t>
+      </w:r>
+      <m:oMath>
+        <m:sSub>
+          <m:sSubPr>
+            <m:ctrlPr>
+              <w:rPr>
+                <w:rFonts w:ascii="Cambria Math" w:hAnsi="Cambria Math"/>
+                <w:sz w:val="24"/>
+                <w:szCs w:val="24"/>
+              </w:rPr>
+            </m:ctrlPr>
+          </m:sSubPr>
+          <m:e>
+            <m:r>
+              <w:rPr>
+                <w:rFonts w:ascii="Cambria Math" w:hAnsi="Cambria Math"/>
+                <w:sz w:val="24"/>
+                <w:szCs w:val="24"/>
+              </w:rPr>
+              <m:t>β</m:t>
+            </m:r>
+          </m:e>
+          <m:sub>
+            <m:r>
+              <w:rPr>
+                <w:rFonts w:ascii="Cambria Math" w:hAnsi="Cambria Math"/>
+                <w:sz w:val="24"/>
+                <w:szCs w:val="24"/>
+              </w:rPr>
+              <m:t>1</m:t>
+            </m:r>
+          </m:sub>
+        </m:sSub>
+      </m:oMath>
+      <w:r>
+        <w:rPr>
+          <w:rFonts w:ascii="Times New Roman" w:hAnsi="Times New Roman" w:cs="Times New Roman"/>
+          <w:sz w:val="24"/>
+          <w:szCs w:val="24"/>
+        </w:rPr>
+        <w:t xml:space="preserve"> co</w:t>
+      </w:r>
+      <w:r>
+        <w:rPr>
+          <w:rFonts w:ascii="Times New Roman" w:hAnsi="Times New Roman" w:cs="Times New Roman"/>
+          <w:sz w:val="24"/>
+          <w:szCs w:val="24"/>
+        </w:rPr>
+        <w:t>unts loops, and</w:t>
+      </w:r>
+      <w:r>
+        <w:rPr>
+          <w:sz w:val="24"/>
+          <w:szCs w:val="24"/>
+        </w:rPr>
+        <w:t xml:space="preserve"> </w:t>
+      </w:r>
+      <m:oMath>
+        <m:sSub>
+          <m:sSubPr>
+            <m:ctrlPr>
+              <w:rPr>
+                <w:rFonts w:ascii="Cambria Math" w:hAnsi="Cambria Math"/>
+                <w:sz w:val="24"/>
+                <w:szCs w:val="24"/>
+              </w:rPr>
+            </m:ctrlPr>
+          </m:sSubPr>
+          <m:e>
+            <m:r>
+              <w:rPr>
+                <w:rFonts w:ascii="Cambria Math" w:hAnsi="Cambria Math"/>
+                <w:sz w:val="24"/>
+                <w:szCs w:val="24"/>
+              </w:rPr>
+              <m:t>β</m:t>
+            </m:r>
+          </m:e>
+          <m:sub>
+            <m:r>
+              <w:rPr>
+                <w:rFonts w:ascii="Cambria Math" w:hAnsi="Cambria Math"/>
+                <w:sz w:val="24"/>
+                <w:szCs w:val="24"/>
+              </w:rPr>
+              <m:t>2</m:t>
+            </m:r>
+          </m:sub>
+        </m:sSub>
+      </m:oMath>
+      <w:r>
+        <w:rPr>
+          <w:rFonts w:ascii="Times New Roman" w:hAnsi="Times New Roman" w:cs="Times New Roman"/>
+          <w:sz w:val="24"/>
+          <w:szCs w:val="24"/>
+        </w:rPr>
+        <w:t xml:space="preserve"> co</w:t>
+      </w:r>
+      <w:r>
+        <w:rPr>
+          <w:rFonts w:ascii="Times New Roman" w:hAnsi="Times New Roman" w:cs="Times New Roman"/>
+          <w:sz w:val="24"/>
+          <w:szCs w:val="24"/>
+        </w:rPr>
+        <w:t>unts enclosed voids. As the filtration grows, features are born and die at thresholds</w:t>
+      </w:r>
+      <w:r>
+        <w:rPr>
+          <w:sz w:val="24"/>
+          <w:szCs w:val="24"/>
+        </w:rPr>
+        <w:t xml:space="preserve"> </w:t>
+      </w:r>
+      <m:oMath>
+        <m:sSub>
+          <m:sSubPr>
+            <m:ctrlPr>
+              <w:rPr>
+                <w:rFonts w:ascii="Cambria Math" w:hAnsi="Cambria Math"/>
+                <w:sz w:val="24"/>
+                <w:szCs w:val="24"/>
+              </w:rPr>
+            </m:ctrlPr>
+          </m:sSubPr>
+          <m:e>
+            <m:r>
+              <w:rPr>
+                <w:rFonts w:ascii="Cambria Math" w:hAnsi="Cambria Math"/>
+                <w:sz w:val="24"/>
+                <w:szCs w:val="24"/>
+              </w:rPr>
+              <m:t>ϵ</m:t>
+            </m:r>
+          </m:e>
+          <m:sub>
+            <m:r>
+              <w:rPr>
+                <w:rFonts w:ascii="Cambria Math" w:hAnsi="Cambria Math"/>
+                <w:sz w:val="24"/>
+                <w:szCs w:val="24"/>
+              </w:rPr>
+              <m:t>birth</m:t>
+            </m:r>
+          </m:sub>
+        </m:sSub>
+      </m:oMath>
+      <w:r>
+        <w:rPr>
+          <w:rFonts w:ascii="Times New Roman" w:hAnsi="Times New Roman" w:cs="Times New Roman"/>
+          <w:sz w:val="24"/>
+          <w:szCs w:val="24"/>
+        </w:rPr>
+        <w:t xml:space="preserve"> an</w:t>
+      </w:r>
+      <w:r>
+        <w:rPr>
+          <w:rFonts w:ascii="Times New Roman" w:hAnsi="Times New Roman" w:cs="Times New Roman"/>
+          <w:sz w:val="24"/>
+          <w:szCs w:val="24"/>
+        </w:rPr>
+        <w:t xml:space="preserve">d </w:t>
+      </w:r>
+      <m:oMath>
+        <m:sSub>
+          <m:sSubPr>
+            <m:ctrlPr>
+              <w:rPr>
+                <w:rFonts w:ascii="Cambria Math" w:hAnsi="Cambria Math"/>
+                <w:sz w:val="24"/>
+                <w:szCs w:val="24"/>
+              </w:rPr>
+            </m:ctrlPr>
+          </m:sSubPr>
+          <m:e>
+            <m:r>
+              <w:rPr>
+                <w:rFonts w:ascii="Cambria Math" w:hAnsi="Cambria Math"/>
+                <w:sz w:val="24"/>
+                <w:szCs w:val="24"/>
+              </w:rPr>
+              <m:t>ϵ</m:t>
+            </m:r>
+          </m:e>
+          <m:sub>
+            <m:r>
+              <w:rPr>
+                <w:rFonts w:ascii="Cambria Math" w:hAnsi="Cambria Math"/>
+                <w:sz w:val="24"/>
+                <w:szCs w:val="24"/>
+              </w:rPr>
+              <m:t>death</m:t>
+            </m:r>
+          </m:sub>
+        </m:sSub>
+      </m:oMath>
+      <w:r>
+        <w:rPr>
+          <w:sz w:val="24"/>
+          <w:szCs w:val="24"/>
+        </w:rPr>
+        <w:t xml:space="preserve">, </w:t>
+      </w:r>
+      <w:r>
+        <w:rPr>
+          <w:rFonts w:ascii="Times New Roman" w:hAnsi="Times New Roman" w:cs="Times New Roman"/>
+          <w:sz w:val="24"/>
+          <w:szCs w:val="24"/>
+        </w:rPr>
+        <w:t xml:space="preserve">with their persistence captured in a </w:t>
+      </w:r>
+      <w:r>
+        <w:rPr>
+          <w:rStyle w:val="Strong"/>
+          <w:rFonts w:ascii="Times New Roman" w:hAnsi="Times New Roman" w:cs="Times New Roman"/>
+          <w:sz w:val="24"/>
+          <w:szCs w:val="24"/>
+        </w:rPr>
+        <w:t>persistence diagram</w:t>
+      </w:r>
+      <w:r>
+        <w:rPr>
+          <w:rFonts w:ascii="Times New Roman" w:hAnsi="Times New Roman" w:cs="Times New Roman"/>
+          <w:sz w:val="24"/>
+          <w:szCs w:val="24"/>
+        </w:rPr>
+        <w:t xml:space="preserve"> or </w:t>
+      </w:r>
+      <w:r>
+        <w:rPr>
+          <w:rStyle w:val="Strong"/>
+          <w:rFonts w:ascii="Times New Roman" w:hAnsi="Times New Roman" w:cs="Times New Roman"/>
+          <w:sz w:val="24"/>
+          <w:szCs w:val="24"/>
+        </w:rPr>
+        <w:t>barcode</w:t>
+      </w:r>
+      <w:r>
+        <w:rPr>
+          <w:rFonts w:ascii="Times New Roman" w:hAnsi="Times New Roman" w:cs="Times New Roman"/>
+          <w:sz w:val="24"/>
+          <w:szCs w:val="24"/>
+        </w:rPr>
+        <w:t>. Long-lived</w:t>
+      </w:r>
+      <w:r>
+        <w:rPr>
+          <w:sz w:val="24"/>
+          <w:szCs w:val="24"/>
+        </w:rPr>
+        <w:t xml:space="preserve"> </w:t>
+      </w:r>
+      <m:oMath>
+        <m:sSub>
+          <m:sSubPr>
+            <m:ctrlPr>
+              <w:rPr>
+                <w:rFonts w:ascii="Cambria Math" w:hAnsi="Cambria Math"/>
+                <w:sz w:val="24"/>
+                <w:szCs w:val="24"/>
+              </w:rPr>
+            </m:ctrlPr>
+          </m:sSubPr>
+          <m:e>
+            <m:r>
+              <w:rPr>
+                <w:rFonts w:ascii="Cambria Math" w:hAnsi="Cambria Math"/>
+                <w:sz w:val="24"/>
+                <w:szCs w:val="24"/>
+              </w:rPr>
+              <m:t>H</m:t>
+            </m:r>
+          </m:e>
+          <m:sub>
+            <m:r>
+              <w:rPr>
+                <w:rFonts w:ascii="Cambria Math" w:hAnsi="Cambria Math"/>
+                <w:sz w:val="24"/>
+                <w:szCs w:val="24"/>
+              </w:rPr>
+              <m:t>0</m:t>
+            </m:r>
+          </m:sub>
+        </m:sSub>
+      </m:oMath>
+      <w:r>
+        <w:rPr>
+          <w:rFonts w:ascii="Times New Roman" w:hAnsi="Times New Roman" w:cs="Times New Roman"/>
+          <w:sz w:val="24"/>
+          <w:szCs w:val="24"/>
+        </w:rPr>
+        <w:t xml:space="preserve"> and</w:t>
+      </w:r>
+      <w:r>
+        <w:rPr>
+          <w:sz w:val="24"/>
+          <w:szCs w:val="24"/>
+        </w:rPr>
+        <w:t xml:space="preserve"> </w:t>
+      </w:r>
+      <m:oMath>
+        <m:sSub>
+          <m:sSubPr>
+            <m:ctrlPr>
+              <w:rPr>
+                <w:rFonts w:ascii="Cambria Math" w:hAnsi="Cambria Math"/>
+                <w:sz w:val="24"/>
+                <w:szCs w:val="24"/>
+              </w:rPr>
+            </m:ctrlPr>
+          </m:sSubPr>
+          <m:e>
+            <m:r>
+              <w:rPr>
+                <w:rFonts w:ascii="Cambria Math" w:hAnsi="Cambria Math"/>
+                <w:sz w:val="24"/>
+                <w:szCs w:val="24"/>
+              </w:rPr>
+              <m:t>H</m:t>
+            </m:r>
+          </m:e>
+          <m:sub>
+            <m:r>
+              <w:rPr>
+                <w:rFonts w:ascii="Cambria Math" w:hAnsi="Cambria Math"/>
+                <w:sz w:val="24"/>
+                <w:szCs w:val="24"/>
+              </w:rPr>
+              <m:t>1</m:t>
+            </m:r>
+          </m:sub>
+        </m:sSub>
+      </m:oMath>
+      <w:r>
+        <w:rPr>
+          <w:rFonts w:ascii="Times New Roman" w:hAnsi="Times New Roman" w:cs="Times New Roman"/>
+          <w:sz w:val="24"/>
+          <w:szCs w:val="24"/>
+        </w:rPr>
+        <w:t>features indicate disconnected or underserved service regions across Los Angeles County.</w:t>
       </w:r>
     </w:p>
     <w:p>
@@ -1326,6 +3094,610 @@
         </w:rPr>
         <w:t>Application</w:t>
       </w:r>
+      <w:r>
+        <w:rPr>
+          <w:rFonts w:ascii="Times New Roman" w:hAnsi="Times New Roman" w:cs="Times New Roman"/>
+          <w:sz w:val="24"/>
+          <w:szCs w:val="24"/>
+        </w:rPr>
+        <w:t>s</w:t>
+      </w:r>
+    </w:p>
+    <w:p>
+      <w:pPr>
+        <w:pStyle w:val="ListParagraph"/>
+        <w:numPr>
+          <w:ilvl w:val="0"/>
+          <w:numId w:val="6"/>
+        </w:numPr>
+        <w:spacing w:line="480" w:lineRule="auto"/>
+        <w:rPr>
+          <w:rFonts w:ascii="Times New Roman" w:hAnsi="Times New Roman" w:cs="Times New Roman"/>
+          <w:sz w:val="24"/>
+          <w:szCs w:val="24"/>
+        </w:rPr>
+      </w:pPr>
+      <w:r>
+        <w:rPr>
+          <w:rFonts w:ascii="Times New Roman" w:hAnsi="Times New Roman" w:cs="Times New Roman"/>
+          <w:sz w:val="24"/>
+          <w:szCs w:val="24"/>
+        </w:rPr>
+        <w:t>Fire Station Locations</w:t>
+      </w:r>
+    </w:p>
+    <w:p>
+      <w:pPr>
+        <w:spacing w:line="480" w:lineRule="auto"/>
+        <w:ind w:left="720" w:firstLine="720"/>
+        <w:rPr>
+          <w:rFonts w:ascii="Times New Roman" w:hAnsi="Times New Roman" w:cs="Times New Roman"/>
+          <w:sz w:val="24"/>
+          <w:szCs w:val="24"/>
+        </w:rPr>
+      </w:pPr>
+      <w:r>
+        <w:rPr>
+          <w:rFonts w:ascii="Times New Roman" w:hAnsi="Times New Roman" w:cs="Times New Roman"/>
+          <w:sz w:val="24"/>
+          <w:szCs w:val="24"/>
+        </w:rPr>
+        <w:t xml:space="preserve">There are total of 412 fire station locations from </w:t>
+      </w:r>
+      <w:r>
+        <w:rPr>
+          <w:rFonts w:ascii="Times New Roman" w:hAnsi="Times New Roman" w:cs="Times New Roman"/>
+          <w:sz w:val="24"/>
+          <w:szCs w:val="24"/>
+        </w:rPr>
+        <w:t>LAFD, LACoFD, and surrounding municipal departments.</w:t>
+      </w:r>
+      <w:r>
+        <w:rPr>
+          <w:rFonts w:ascii="Times New Roman" w:hAnsi="Times New Roman" w:cs="Times New Roman"/>
+          <w:sz w:val="24"/>
+          <w:szCs w:val="24"/>
+        </w:rPr>
+        <w:t xml:space="preserve"> We will also clip fire stations that are within the la_county.geojson file we have</w:t>
+      </w:r>
+      <w:r>
+        <w:rPr>
+          <w:rFonts w:ascii="Times New Roman" w:hAnsi="Times New Roman" w:cs="Times New Roman"/>
+          <w:sz w:val="24"/>
+          <w:szCs w:val="24"/>
+        </w:rPr>
+        <w:t xml:space="preserve">. </w:t>
+      </w:r>
+      <w:r>
+        <w:rPr>
+          <w:rFonts w:ascii="Times New Roman" w:hAnsi="Times New Roman" w:cs="Times New Roman"/>
+          <w:sz w:val="24"/>
+          <w:szCs w:val="24"/>
+        </w:rPr>
+        <w:t>The primary analysis uses Vietoris-Rips Witness</w:t>
+      </w:r>
+      <w:r>
+        <w:rPr>
+          <w:rFonts w:ascii="Times New Roman" w:hAnsi="Times New Roman" w:cs="Times New Roman"/>
+          <w:sz w:val="24"/>
+          <w:szCs w:val="24"/>
+        </w:rPr>
+        <w:t xml:space="preserve">, where we would have a circular radius bubble around each fire stations. </w:t>
+      </w:r>
+      <w:r>
+        <w:rPr>
+          <w:rFonts w:ascii="Times New Roman" w:hAnsi="Times New Roman" w:cs="Times New Roman"/>
+          <w:sz w:val="24"/>
+          <w:szCs w:val="24"/>
+        </w:rPr>
+        <w:t>As that radius grows, bubbles begin to overlap and stations connect into clusters.</w:t>
+      </w:r>
+      <w:r>
+        <w:rPr>
+          <w:rFonts w:ascii="Times New Roman" w:hAnsi="Times New Roman" w:cs="Times New Roman"/>
+          <w:sz w:val="24"/>
+          <w:szCs w:val="24"/>
+        </w:rPr>
+        <w:t xml:space="preserve"> </w:t>
+      </w:r>
+      <w:r>
+        <w:rPr>
+          <w:rFonts w:ascii="Times New Roman" w:hAnsi="Times New Roman" w:cs="Times New Roman"/>
+          <w:sz w:val="24"/>
+          <w:szCs w:val="24"/>
+        </w:rPr>
+        <w:t>H0</w:t>
+      </w:r>
+      <w:r>
+        <w:rPr>
+          <w:rFonts w:ascii="Times New Roman" w:hAnsi="Times New Roman" w:cs="Times New Roman"/>
+          <w:sz w:val="24"/>
+          <w:szCs w:val="24"/>
+        </w:rPr>
+        <w:t xml:space="preserve"> </w:t>
+      </w:r>
+      <w:r>
+        <w:rPr>
+          <w:rFonts w:ascii="Times New Roman" w:hAnsi="Times New Roman" w:cs="Times New Roman"/>
+          <w:sz w:val="24"/>
+          <w:szCs w:val="24"/>
+        </w:rPr>
+        <w:t>records when isolated clusters merge</w:t>
+      </w:r>
+      <w:r>
+        <w:rPr>
+          <w:rFonts w:ascii="Times New Roman" w:hAnsi="Times New Roman" w:cs="Times New Roman"/>
+          <w:sz w:val="24"/>
+          <w:szCs w:val="24"/>
+        </w:rPr>
+        <w:t xml:space="preserve">, </w:t>
+      </w:r>
+      <w:r>
+        <w:rPr>
+          <w:rFonts w:ascii="Times New Roman" w:hAnsi="Times New Roman" w:cs="Times New Roman"/>
+          <w:sz w:val="24"/>
+          <w:szCs w:val="24"/>
+        </w:rPr>
+        <w:t>indicates a sparsely covered region far from the rest of the network</w:t>
+      </w:r>
+      <w:r>
+        <w:rPr>
+          <w:rFonts w:ascii="Times New Roman" w:hAnsi="Times New Roman" w:cs="Times New Roman"/>
+          <w:sz w:val="24"/>
+          <w:szCs w:val="24"/>
+        </w:rPr>
+        <w:t xml:space="preserve">. </w:t>
+      </w:r>
+      <w:r>
+        <w:rPr>
+          <w:rFonts w:ascii="Times New Roman" w:hAnsi="Times New Roman" w:cs="Times New Roman"/>
+          <w:sz w:val="24"/>
+          <w:szCs w:val="24"/>
+        </w:rPr>
+        <w:t xml:space="preserve">The </w:t>
+      </w:r>
+      <w:r>
+        <w:rPr>
+          <w:rFonts w:ascii="Times New Roman" w:hAnsi="Times New Roman" w:cs="Times New Roman"/>
+          <w:sz w:val="24"/>
+          <w:szCs w:val="24"/>
+        </w:rPr>
+        <w:lastRenderedPageBreak/>
+        <w:t>second, H1, records when stations encircle an area with none inside it</w:t>
+      </w:r>
+      <w:r>
+        <w:rPr>
+          <w:rFonts w:ascii="Times New Roman" w:hAnsi="Times New Roman" w:cs="Times New Roman"/>
+          <w:sz w:val="24"/>
+          <w:szCs w:val="24"/>
+        </w:rPr>
+        <w:t xml:space="preserve">, suggesting coverage void for that area. </w:t>
+      </w:r>
+    </w:p>
+    <w:p>
+      <w:pPr>
+        <w:pStyle w:val="ListParagraph"/>
+        <w:spacing w:line="480" w:lineRule="auto"/>
+        <w:ind w:left="1440"/>
+        <w:rPr>
+          <w:rFonts w:ascii="Times New Roman" w:hAnsi="Times New Roman" w:cs="Times New Roman"/>
+          <w:sz w:val="24"/>
+          <w:szCs w:val="24"/>
+        </w:rPr>
+      </w:pPr>
+      <w:r>
+        <w:rPr>
+          <w:rFonts w:ascii="Times New Roman" w:hAnsi="Times New Roman" w:cs="Times New Roman"/>
+          <w:sz w:val="24"/>
+          <w:szCs w:val="24"/>
+        </w:rPr>
+        <w:t>(Fill in the code/Mathematical formula)</w:t>
+      </w:r>
+    </w:p>
+    <w:p>
+      <w:pPr>
+        <w:spacing w:line="480" w:lineRule="auto"/>
+        <w:ind w:left="720" w:firstLine="720"/>
+        <w:rPr>
+          <w:rFonts w:ascii="Times New Roman" w:hAnsi="Times New Roman" w:cs="Times New Roman"/>
+          <w:sz w:val="24"/>
+          <w:szCs w:val="24"/>
+        </w:rPr>
+      </w:pPr>
+    </w:p>
+    <w:p>
+      <w:pPr>
+        <w:spacing w:line="480" w:lineRule="auto"/>
+        <w:ind w:left="720" w:firstLine="720"/>
+        <w:rPr>
+          <w:rFonts w:ascii="Times New Roman" w:hAnsi="Times New Roman" w:cs="Times New Roman"/>
+          <w:sz w:val="24"/>
+          <w:szCs w:val="24"/>
+        </w:rPr>
+      </w:pPr>
+      <w:r>
+        <w:rPr>
+          <w:rFonts w:ascii="Times New Roman" w:hAnsi="Times New Roman" w:cs="Times New Roman"/>
+          <w:sz w:val="24"/>
+          <w:szCs w:val="24"/>
+        </w:rPr>
+        <w:t xml:space="preserve">A Witness complex is constructed </w:t>
+      </w:r>
+      <w:r>
+        <w:rPr>
+          <w:rFonts w:ascii="Times New Roman" w:hAnsi="Times New Roman" w:cs="Times New Roman"/>
+          <w:sz w:val="24"/>
+          <w:szCs w:val="24"/>
+        </w:rPr>
+        <w:t xml:space="preserve">as computational check. </w:t>
+      </w:r>
+      <w:r>
+        <w:rPr>
+          <w:rFonts w:ascii="Times New Roman" w:hAnsi="Times New Roman" w:cs="Times New Roman"/>
+          <w:sz w:val="24"/>
+          <w:szCs w:val="24"/>
+        </w:rPr>
+        <w:t xml:space="preserve">We used a </w:t>
+      </w:r>
+      <w:proofErr w:type="spellStart"/>
+      <w:r>
+        <w:rPr>
+          <w:rFonts w:ascii="Times New Roman" w:hAnsi="Times New Roman" w:cs="Times New Roman"/>
+          <w:sz w:val="24"/>
+          <w:szCs w:val="24"/>
+        </w:rPr>
+        <w:t>MaxMin</w:t>
+      </w:r>
+      <w:proofErr w:type="spellEnd"/>
+      <w:r>
+        <w:rPr>
+          <w:rFonts w:ascii="Times New Roman" w:hAnsi="Times New Roman" w:cs="Times New Roman"/>
+          <w:sz w:val="24"/>
+          <w:szCs w:val="24"/>
+        </w:rPr>
+        <w:t xml:space="preserve"> </w:t>
+      </w:r>
+      <w:r>
+        <w:rPr>
+          <w:rFonts w:ascii="Times New Roman" w:hAnsi="Times New Roman" w:cs="Times New Roman"/>
+          <w:sz w:val="24"/>
+          <w:szCs w:val="24"/>
+        </w:rPr>
+        <w:t>selection function for choosing the landmarks, choosing the points furthest from current landmark set, ensuring full representation coverage. I</w:t>
+      </w:r>
+      <w:r>
+        <w:rPr>
+          <w:rFonts w:ascii="Times New Roman" w:hAnsi="Times New Roman" w:cs="Times New Roman"/>
+          <w:sz w:val="24"/>
+          <w:szCs w:val="24"/>
+        </w:rPr>
+        <w:t>t selects 80 representative landmark stations</w:t>
+      </w:r>
+      <w:r>
+        <w:rPr>
+          <w:rFonts w:ascii="Times New Roman" w:hAnsi="Times New Roman" w:cs="Times New Roman"/>
+          <w:sz w:val="24"/>
+          <w:szCs w:val="24"/>
+        </w:rPr>
+        <w:t xml:space="preserve">. </w:t>
+      </w:r>
+    </w:p>
+    <w:p>
+      <w:pPr>
+        <w:pStyle w:val="ListParagraph"/>
+        <w:spacing w:line="480" w:lineRule="auto"/>
+        <w:ind w:left="1440"/>
+        <w:rPr>
+          <w:rFonts w:ascii="Times New Roman" w:hAnsi="Times New Roman" w:cs="Times New Roman"/>
+          <w:sz w:val="24"/>
+          <w:szCs w:val="24"/>
+        </w:rPr>
+      </w:pPr>
+      <w:r>
+        <w:rPr>
+          <w:rFonts w:ascii="Times New Roman" w:hAnsi="Times New Roman" w:cs="Times New Roman"/>
+          <w:sz w:val="24"/>
+          <w:szCs w:val="24"/>
+        </w:rPr>
+        <w:t>(Fill in the code/Mathematical formula)</w:t>
+      </w:r>
+    </w:p>
+    <w:p>
+      <w:pPr>
+        <w:spacing w:line="480" w:lineRule="auto"/>
+        <w:ind w:left="720" w:firstLine="720"/>
+        <w:rPr>
+          <w:rFonts w:ascii="Times New Roman" w:hAnsi="Times New Roman" w:cs="Times New Roman"/>
+          <w:sz w:val="24"/>
+          <w:szCs w:val="24"/>
+        </w:rPr>
+      </w:pPr>
+    </w:p>
+    <w:p>
+      <w:pPr>
+        <w:spacing w:line="480" w:lineRule="auto"/>
+        <w:ind w:left="720" w:firstLine="720"/>
+        <w:rPr>
+          <w:rFonts w:ascii="Times New Roman" w:hAnsi="Times New Roman" w:cs="Times New Roman"/>
+          <w:sz w:val="24"/>
+          <w:szCs w:val="24"/>
+        </w:rPr>
+      </w:pPr>
+      <w:r>
+        <w:rPr>
+          <w:rFonts w:ascii="Times New Roman" w:hAnsi="Times New Roman" w:cs="Times New Roman"/>
+          <w:sz w:val="24"/>
+          <w:szCs w:val="24"/>
+        </w:rPr>
+        <w:t xml:space="preserve">The analysis then evaluates how many disconnected clusters and independent voids exist at operationally meaningful distances </w:t>
+      </w:r>
+      <w:r>
+        <w:rPr>
+          <w:rFonts w:ascii="Times New Roman" w:hAnsi="Times New Roman" w:cs="Times New Roman"/>
+          <w:sz w:val="24"/>
+          <w:szCs w:val="24"/>
+        </w:rPr>
+        <w:t xml:space="preserve">, from </w:t>
+      </w:r>
+      <w:r>
+        <w:rPr>
+          <w:rFonts w:ascii="Times New Roman" w:hAnsi="Times New Roman" w:cs="Times New Roman"/>
+          <w:sz w:val="24"/>
+          <w:szCs w:val="24"/>
+        </w:rPr>
+        <w:t>2 km through 20 km</w:t>
+      </w:r>
+      <w:r>
+        <w:rPr>
+          <w:rFonts w:ascii="Times New Roman" w:hAnsi="Times New Roman" w:cs="Times New Roman"/>
+          <w:sz w:val="24"/>
+          <w:szCs w:val="24"/>
+        </w:rPr>
+        <w:t xml:space="preserve">, </w:t>
+      </w:r>
+      <w:r>
+        <w:rPr>
+          <w:rFonts w:ascii="Times New Roman" w:hAnsi="Times New Roman" w:cs="Times New Roman"/>
+          <w:sz w:val="24"/>
+          <w:szCs w:val="24"/>
+        </w:rPr>
+        <w:t xml:space="preserve">corresponding to </w:t>
+      </w:r>
+      <w:r>
+        <w:rPr>
+          <w:rFonts w:ascii="Times New Roman" w:hAnsi="Times New Roman" w:cs="Times New Roman"/>
+          <w:sz w:val="24"/>
+          <w:szCs w:val="24"/>
+        </w:rPr>
+        <w:t>first responde</w:t>
+      </w:r>
+      <w:r>
+        <w:rPr>
+          <w:rFonts w:ascii="Times New Roman" w:hAnsi="Times New Roman" w:cs="Times New Roman"/>
+          <w:sz w:val="24"/>
+          <w:szCs w:val="24"/>
+        </w:rPr>
+        <w:t>rs</w:t>
+      </w:r>
+      <w:r>
+        <w:rPr>
+          <w:rFonts w:ascii="Times New Roman" w:hAnsi="Times New Roman" w:cs="Times New Roman"/>
+          <w:sz w:val="24"/>
+          <w:szCs w:val="24"/>
+        </w:rPr>
+        <w:t xml:space="preserve"> and wildfire s</w:t>
+      </w:r>
+      <w:r>
+        <w:rPr>
+          <w:rFonts w:ascii="Times New Roman" w:hAnsi="Times New Roman" w:cs="Times New Roman"/>
+          <w:sz w:val="24"/>
+          <w:szCs w:val="24"/>
+        </w:rPr>
+        <w:t>afety</w:t>
+      </w:r>
+      <w:r>
+        <w:rPr>
+          <w:rFonts w:ascii="Times New Roman" w:hAnsi="Times New Roman" w:cs="Times New Roman"/>
+          <w:sz w:val="24"/>
+          <w:szCs w:val="24"/>
+        </w:rPr>
+        <w:t xml:space="preserve"> standards. H1 features that persist for less than 3 km are treated as noise and discarded; those that survive represent gaps large enough to matter in a real emergency.</w:t>
+      </w:r>
+    </w:p>
+    <w:p>
+      <w:pPr>
+        <w:pStyle w:val="ListParagraph"/>
+        <w:spacing w:line="480" w:lineRule="auto"/>
+        <w:ind w:left="1440"/>
+        <w:rPr>
+          <w:rFonts w:ascii="Times New Roman" w:hAnsi="Times New Roman" w:cs="Times New Roman"/>
+          <w:sz w:val="24"/>
+          <w:szCs w:val="24"/>
+        </w:rPr>
+      </w:pPr>
+      <w:r>
+        <w:rPr>
+          <w:rFonts w:ascii="Times New Roman" w:hAnsi="Times New Roman" w:cs="Times New Roman"/>
+          <w:sz w:val="24"/>
+          <w:szCs w:val="24"/>
+        </w:rPr>
+        <w:t>(Fill in the code/Mathematical formula)</w:t>
+      </w:r>
+    </w:p>
+    <w:p>
+      <w:pPr>
+        <w:spacing w:line="480" w:lineRule="auto"/>
+        <w:ind w:left="720" w:firstLine="720"/>
+        <w:rPr>
+          <w:rFonts w:ascii="Times New Roman" w:hAnsi="Times New Roman" w:cs="Times New Roman"/>
+          <w:sz w:val="24"/>
+          <w:szCs w:val="24"/>
+        </w:rPr>
+      </w:pPr>
+    </w:p>
+    <w:p>
+      <w:pPr>
+        <w:spacing w:line="480" w:lineRule="auto"/>
+        <w:ind w:left="720" w:firstLine="720"/>
+        <w:rPr>
+          <w:rFonts w:ascii="Times New Roman" w:hAnsi="Times New Roman" w:cs="Times New Roman"/>
+          <w:sz w:val="24"/>
+          <w:szCs w:val="24"/>
+        </w:rPr>
+      </w:pPr>
+      <w:r>
+        <w:rPr>
+          <w:rFonts w:ascii="Times New Roman" w:hAnsi="Times New Roman" w:cs="Times New Roman"/>
+          <w:sz w:val="24"/>
+          <w:szCs w:val="24"/>
+        </w:rPr>
+        <w:t xml:space="preserve">Finally, each significant void is </w:t>
+      </w:r>
+      <w:r>
+        <w:rPr>
+          <w:rFonts w:ascii="Times New Roman" w:hAnsi="Times New Roman" w:cs="Times New Roman"/>
+          <w:sz w:val="24"/>
+          <w:szCs w:val="24"/>
+        </w:rPr>
+        <w:t xml:space="preserve">tied </w:t>
+      </w:r>
+      <w:r>
+        <w:rPr>
+          <w:rFonts w:ascii="Times New Roman" w:hAnsi="Times New Roman" w:cs="Times New Roman"/>
+          <w:sz w:val="24"/>
+          <w:szCs w:val="24"/>
+        </w:rPr>
+        <w:t>to a physical location</w:t>
+      </w:r>
+      <w:r>
+        <w:rPr>
+          <w:rFonts w:ascii="Times New Roman" w:hAnsi="Times New Roman" w:cs="Times New Roman"/>
+          <w:sz w:val="24"/>
+          <w:szCs w:val="24"/>
+        </w:rPr>
+        <w:t>,</w:t>
+      </w:r>
+      <w:r>
+        <w:t xml:space="preserve"> </w:t>
+      </w:r>
+      <w:r>
+        <w:rPr>
+          <w:rFonts w:ascii="Times New Roman" w:hAnsi="Times New Roman" w:cs="Times New Roman"/>
+          <w:sz w:val="24"/>
+          <w:szCs w:val="24"/>
+        </w:rPr>
+        <w:t>producing a ranked list of coverage gaps</w:t>
+      </w:r>
+    </w:p>
+    <w:p>
+      <w:pPr>
+        <w:pStyle w:val="ListParagraph"/>
+        <w:spacing w:line="480" w:lineRule="auto"/>
+        <w:ind w:left="1440"/>
+        <w:rPr>
+          <w:rFonts w:ascii="Times New Roman" w:hAnsi="Times New Roman" w:cs="Times New Roman"/>
+          <w:sz w:val="24"/>
+          <w:szCs w:val="24"/>
+        </w:rPr>
+      </w:pPr>
+      <w:r>
+        <w:rPr>
+          <w:rFonts w:ascii="Times New Roman" w:hAnsi="Times New Roman" w:cs="Times New Roman"/>
+          <w:sz w:val="24"/>
+          <w:szCs w:val="24"/>
+        </w:rPr>
+        <w:t>(Fill in the code/Mathematical formula)</w:t>
+      </w:r>
+    </w:p>
+    <w:p>
+      <w:pPr>
+        <w:pStyle w:val="ListParagraph"/>
+        <w:numPr>
+          <w:ilvl w:val="0"/>
+          <w:numId w:val="6"/>
+        </w:numPr>
+        <w:spacing w:line="480" w:lineRule="auto"/>
+        <w:rPr>
+          <w:rFonts w:ascii="Times New Roman" w:hAnsi="Times New Roman" w:cs="Times New Roman"/>
+          <w:sz w:val="24"/>
+          <w:szCs w:val="24"/>
+        </w:rPr>
+      </w:pPr>
+      <w:r>
+        <w:rPr>
+          <w:rFonts w:ascii="Times New Roman" w:hAnsi="Times New Roman" w:cs="Times New Roman"/>
+          <w:sz w:val="24"/>
+          <w:szCs w:val="24"/>
+        </w:rPr>
+        <w:t>Fire Hydrant Locations</w:t>
+      </w:r>
+    </w:p>
+    <w:p>
+      <w:pPr>
+        <w:ind w:left="720" w:firstLine="360"/>
+        <w:rPr>
+          <w:rFonts w:ascii="Times New Roman" w:hAnsi="Times New Roman" w:cs="Times New Roman"/>
+          <w:sz w:val="24"/>
+          <w:szCs w:val="24"/>
+        </w:rPr>
+      </w:pPr>
+      <w:r>
+        <w:rPr>
+          <w:rFonts w:ascii="Times New Roman" w:hAnsi="Times New Roman" w:cs="Times New Roman"/>
+          <w:sz w:val="24"/>
+          <w:szCs w:val="24"/>
+        </w:rPr>
+        <w:t xml:space="preserve">For this dataset, we applied the same TDA pipeline from the works on the Fire Stations dataset. However, since this dataset has a large point cloud, 60,295 points, which would make Vietoris-Rips computationally intractable. We would opt for grid sampling where we would circle the fire hydrants in a 500 meters grid before applying VR-Witness </w:t>
+      </w:r>
+      <w:r>
+        <w:rPr>
+          <w:rFonts w:ascii="Times New Roman" w:hAnsi="Times New Roman" w:cs="Times New Roman"/>
+          <w:sz w:val="24"/>
+          <w:szCs w:val="24"/>
+        </w:rPr>
+        <w:lastRenderedPageBreak/>
+        <w:t>analysis. We would also opt for doing Witness complex, using the same method as before to capture coverage gaps that subsampling misses</w:t>
+      </w:r>
+      <w:r>
+        <w:rPr>
+          <w:rFonts w:ascii="Times New Roman" w:hAnsi="Times New Roman" w:cs="Times New Roman"/>
+          <w:sz w:val="24"/>
+          <w:szCs w:val="24"/>
+        </w:rPr>
+        <w:t xml:space="preserve">. </w:t>
+      </w:r>
+    </w:p>
+    <w:p>
+      <w:pPr>
+        <w:pStyle w:val="ListParagraph"/>
+        <w:spacing w:line="480" w:lineRule="auto"/>
+        <w:ind w:left="1440"/>
+        <w:rPr>
+          <w:rFonts w:ascii="Times New Roman" w:hAnsi="Times New Roman" w:cs="Times New Roman"/>
+          <w:sz w:val="24"/>
+          <w:szCs w:val="24"/>
+        </w:rPr>
+      </w:pPr>
+      <w:r>
+        <w:rPr>
+          <w:rFonts w:ascii="Times New Roman" w:hAnsi="Times New Roman" w:cs="Times New Roman"/>
+          <w:sz w:val="24"/>
+          <w:szCs w:val="24"/>
+        </w:rPr>
+        <w:t>(Fill in the code/Mathematical formula)</w:t>
+      </w:r>
+    </w:p>
+    <w:p>
+      <w:pPr>
+        <w:pStyle w:val="ListParagraph"/>
+        <w:spacing w:line="480" w:lineRule="auto"/>
+        <w:ind w:left="1440"/>
+        <w:rPr>
+          <w:rFonts w:ascii="Times New Roman" w:hAnsi="Times New Roman" w:cs="Times New Roman"/>
+          <w:sz w:val="24"/>
+          <w:szCs w:val="24"/>
+        </w:rPr>
+      </w:pPr>
     </w:p>
     <w:p>
       <w:pPr>
@@ -1337,7 +3709,7 @@
         <w:spacing w:line="480" w:lineRule="auto"/>
       </w:pPr>
       <w:r>
-        <w:t>Mapper Algorithm</w:t>
+        <w:t>Multi-layered Persistent Homology</w:t>
       </w:r>
     </w:p>
     <w:p>
@@ -1360,15 +3732,172 @@
           <w:sz w:val="24"/>
           <w:szCs w:val="24"/>
         </w:rPr>
-        <w:t>Theoretical</w:t>
-      </w:r>
-      <w:r>
-        <w:rPr>
-          <w:rFonts w:ascii="Times New Roman" w:hAnsi="Times New Roman" w:cs="Times New Roman"/>
-          <w:sz w:val="24"/>
-          <w:szCs w:val="24"/>
-        </w:rPr>
-        <w:t xml:space="preserve"> Background</w:t>
+        <w:t>Theoretical Background</w:t>
+      </w:r>
+    </w:p>
+    <w:p>
+      <w:pPr>
+        <w:spacing w:line="480" w:lineRule="auto"/>
+        <w:ind w:left="720"/>
+        <w:rPr>
+          <w:rFonts w:ascii="Times New Roman" w:hAnsi="Times New Roman" w:cs="Times New Roman"/>
+          <w:sz w:val="24"/>
+          <w:szCs w:val="24"/>
+        </w:rPr>
+      </w:pPr>
+      <w:r>
+        <w:rPr>
+          <w:rFonts w:ascii="Times New Roman" w:hAnsi="Times New Roman" w:cs="Times New Roman"/>
+          <w:sz w:val="24"/>
+          <w:szCs w:val="24"/>
+        </w:rPr>
+        <w:t>Standard persistent homology in section B focus on single point cloud filtered by one parameter, which is Euclidean distance calculated using LA county dataset. While dis captures the topological structure of each infrastructure like fire stations or fire hydrants independently, it failed to answer questions like where are communities simultaneously far from first responder but also have higher socio-economic risk ? Addressing that question leads us to build a multi-layered Persistent Homology method. In which, the filtration for n &gt; 1, in this case n = 2, which are the geographic positions and its associated Heat Vulnerability Index score.</w:t>
+      </w:r>
+    </w:p>
+    <w:p>
+      <w:pPr>
+        <w:spacing w:line="480" w:lineRule="auto"/>
+        <w:ind w:left="720"/>
+        <w:rPr>
+          <w:rFonts w:ascii="Times New Roman" w:hAnsi="Times New Roman" w:cs="Times New Roman"/>
+          <w:sz w:val="24"/>
+          <w:szCs w:val="24"/>
+        </w:rPr>
+      </w:pPr>
+      <w:r>
+        <w:rPr>
+          <w:rFonts w:ascii="Times New Roman" w:hAnsi="Times New Roman" w:cs="Times New Roman"/>
+          <w:sz w:val="24"/>
+          <w:szCs w:val="24"/>
+        </w:rPr>
+        <w:t>With two parameters, a simplex is only included when both conditions are satisfied simultaneously: the geographic distance condition and the vulnerability condition. This means two fire stations that are close together geographically but serve populations with very different HVI scores will remain disconnected in the filtration longer than two stations that are both geographically close and serve similarly vulnerable populations. The holes that survive longest in the resulting persistence diagram are therefore the truly compound risk zones</w:t>
+      </w:r>
+      <w:r>
+        <w:rPr>
+          <w:rFonts w:ascii="Times New Roman" w:hAnsi="Times New Roman" w:cs="Times New Roman"/>
+          <w:sz w:val="24"/>
+          <w:szCs w:val="24"/>
+        </w:rPr>
+        <w:t>,</w:t>
+      </w:r>
+      <w:r>
+        <w:rPr>
+          <w:rFonts w:ascii="Times New Roman" w:hAnsi="Times New Roman" w:cs="Times New Roman"/>
+          <w:sz w:val="24"/>
+          <w:szCs w:val="24"/>
+        </w:rPr>
+        <w:t xml:space="preserve"> regions that are isolated from first responders and sit within high-vulnerability communities.</w:t>
+      </w:r>
+    </w:p>
+    <w:p>
+      <w:pPr>
+        <w:spacing w:line="480" w:lineRule="auto"/>
+        <w:ind w:left="720"/>
+        <w:rPr>
+          <w:rFonts w:ascii="Times New Roman" w:hAnsi="Times New Roman" w:cs="Times New Roman"/>
+          <w:sz w:val="24"/>
+          <w:szCs w:val="24"/>
+        </w:rPr>
+      </w:pPr>
+      <w:r>
+        <w:rPr>
+          <w:rFonts w:ascii="Times New Roman" w:hAnsi="Times New Roman" w:cs="Times New Roman"/>
+          <w:sz w:val="24"/>
+          <w:szCs w:val="24"/>
+        </w:rPr>
+        <w:t>E</w:t>
+      </w:r>
+      <w:r>
+        <w:rPr>
+          <w:rFonts w:ascii="Times New Roman" w:hAnsi="Times New Roman" w:cs="Times New Roman"/>
+          <w:sz w:val="24"/>
+          <w:szCs w:val="24"/>
+        </w:rPr>
+        <w:t xml:space="preserve">ach point's vulnerability score is encoded as a third coordinate, scaling it by a factor α so that the vulnerability dimension is comparable in magnitude to geographic distance. </w:t>
+      </w:r>
+      <w:r>
+        <w:rPr>
+          <w:rFonts w:ascii="Times New Roman" w:hAnsi="Times New Roman" w:cs="Times New Roman"/>
+          <w:sz w:val="24"/>
+          <w:szCs w:val="24"/>
+        </w:rPr>
+        <w:lastRenderedPageBreak/>
+        <w:t>To go beyond heat vulnerability alone, we construct a single composite score per census tract by equally weighting the normalized HVI and SVI values, yielding coordinates (x, y, α·v). Classical Rips persistent homology is then run on this 3D point cloud using GUDHI, producing standard H0 and H1 diagrams. Setting α = 0 collapses the method back to standard 2D persistent homology; as α increases, the vulnerability dimension plays a larger role in shaping the topology.</w:t>
+      </w:r>
+    </w:p>
+    <w:p>
+      <w:pPr>
+        <w:spacing w:line="480" w:lineRule="auto"/>
+        <w:ind w:left="720"/>
+        <w:rPr>
+          <w:rFonts w:ascii="Times New Roman" w:hAnsi="Times New Roman" w:cs="Times New Roman"/>
+          <w:sz w:val="24"/>
+          <w:szCs w:val="24"/>
+        </w:rPr>
+      </w:pPr>
+      <w:r>
+        <w:rPr>
+          <w:rFonts w:ascii="Times New Roman" w:hAnsi="Times New Roman" w:cs="Times New Roman"/>
+          <w:sz w:val="24"/>
+          <w:szCs w:val="24"/>
+        </w:rPr>
+        <w:t>A long-lived H1 hole in the resulting diagram marks a region that is simultaneously a geographic coverage void and surrounded by high-vulnerability census tracts</w:t>
+      </w:r>
+      <w:r>
+        <w:rPr>
+          <w:rFonts w:ascii="Times New Roman" w:hAnsi="Times New Roman" w:cs="Times New Roman"/>
+          <w:sz w:val="24"/>
+          <w:szCs w:val="24"/>
+        </w:rPr>
+        <w:t xml:space="preserve">. </w:t>
+      </w:r>
+      <w:r>
+        <w:rPr>
+          <w:rFonts w:ascii="Times New Roman" w:hAnsi="Times New Roman" w:cs="Times New Roman"/>
+          <w:sz w:val="24"/>
+          <w:szCs w:val="24"/>
+        </w:rPr>
+        <w:t xml:space="preserve">Neighborhoods located at the </w:t>
+      </w:r>
+      <w:r>
+        <w:rPr>
+          <w:rFonts w:ascii="Times New Roman" w:hAnsi="Times New Roman" w:cs="Times New Roman"/>
+          <w:sz w:val="24"/>
+          <w:szCs w:val="24"/>
+        </w:rPr>
+        <w:t>centers</w:t>
+      </w:r>
+      <w:r>
+        <w:rPr>
+          <w:rFonts w:ascii="Times New Roman" w:hAnsi="Times New Roman" w:cs="Times New Roman"/>
+          <w:sz w:val="24"/>
+          <w:szCs w:val="24"/>
+        </w:rPr>
+        <w:t xml:space="preserve"> of the most persistent H1 holes are therefore not only</w:t>
+      </w:r>
+      <w:r>
+        <w:rPr>
+          <w:rFonts w:ascii="Times New Roman" w:hAnsi="Times New Roman" w:cs="Times New Roman"/>
+          <w:sz w:val="24"/>
+          <w:szCs w:val="24"/>
+        </w:rPr>
+        <w:t xml:space="preserve"> </w:t>
+      </w:r>
+      <w:r>
+        <w:rPr>
+          <w:rFonts w:ascii="Times New Roman" w:hAnsi="Times New Roman" w:cs="Times New Roman"/>
+          <w:sz w:val="24"/>
+          <w:szCs w:val="24"/>
+        </w:rPr>
+        <w:t>underserved</w:t>
+      </w:r>
+      <w:r>
+        <w:rPr>
+          <w:rFonts w:ascii="Times New Roman" w:hAnsi="Times New Roman" w:cs="Times New Roman"/>
+          <w:sz w:val="24"/>
+          <w:szCs w:val="24"/>
+        </w:rPr>
+        <w:t xml:space="preserve"> but also at higher risk when it comes to wildfires. </w:t>
       </w:r>
     </w:p>
     <w:p>
@@ -1396,6 +3925,103 @@
     </w:p>
     <w:p>
       <w:pPr>
+        <w:pStyle w:val="ListParagraph"/>
+        <w:spacing w:line="480" w:lineRule="auto"/>
+        <w:ind w:left="1080"/>
+        <w:rPr>
+          <w:rFonts w:ascii="Times New Roman" w:hAnsi="Times New Roman" w:cs="Times New Roman"/>
+          <w:sz w:val="24"/>
+          <w:szCs w:val="24"/>
+        </w:rPr>
+      </w:pPr>
+      <w:r>
+        <w:rPr>
+          <w:rFonts w:ascii="Times New Roman" w:hAnsi="Times New Roman" w:cs="Times New Roman"/>
+          <w:sz w:val="24"/>
+          <w:szCs w:val="24"/>
+        </w:rPr>
+        <w:t>(Fill in the code/Mathematical formula)</w:t>
+      </w:r>
+    </w:p>
+    <w:p>
+      <w:pPr>
+        <w:spacing w:line="480" w:lineRule="auto"/>
+        <w:rPr>
+          <w:rFonts w:ascii="Times New Roman" w:hAnsi="Times New Roman" w:cs="Times New Roman"/>
+          <w:sz w:val="24"/>
+          <w:szCs w:val="24"/>
+        </w:rPr>
+      </w:pPr>
+    </w:p>
+    <w:p>
+      <w:pPr>
+        <w:pStyle w:val="Heading2"/>
+        <w:numPr>
+          <w:ilvl w:val="0"/>
+          <w:numId w:val="1"/>
+        </w:numPr>
+        <w:spacing w:line="480" w:lineRule="auto"/>
+      </w:pPr>
+      <w:r>
+        <w:t>Mapper Algorithm</w:t>
+      </w:r>
+    </w:p>
+    <w:p>
+      <w:pPr>
+        <w:pStyle w:val="ListParagraph"/>
+        <w:numPr>
+          <w:ilvl w:val="0"/>
+          <w:numId w:val="8"/>
+        </w:numPr>
+        <w:spacing w:line="480" w:lineRule="auto"/>
+        <w:rPr>
+          <w:rFonts w:ascii="Times New Roman" w:hAnsi="Times New Roman" w:cs="Times New Roman"/>
+          <w:sz w:val="24"/>
+          <w:szCs w:val="24"/>
+        </w:rPr>
+      </w:pPr>
+      <w:r>
+        <w:rPr>
+          <w:rFonts w:ascii="Times New Roman" w:hAnsi="Times New Roman" w:cs="Times New Roman"/>
+          <w:sz w:val="24"/>
+          <w:szCs w:val="24"/>
+        </w:rPr>
+        <w:t>Theoretical</w:t>
+      </w:r>
+      <w:r>
+        <w:rPr>
+          <w:rFonts w:ascii="Times New Roman" w:hAnsi="Times New Roman" w:cs="Times New Roman"/>
+          <w:sz w:val="24"/>
+          <w:szCs w:val="24"/>
+        </w:rPr>
+        <w:t xml:space="preserve"> Background</w:t>
+      </w:r>
+    </w:p>
+    <w:p>
+      <w:pPr>
+        <w:pStyle w:val="ListParagraph"/>
+        <w:numPr>
+          <w:ilvl w:val="0"/>
+          <w:numId w:val="8"/>
+        </w:numPr>
+        <w:spacing w:line="480" w:lineRule="auto"/>
+        <w:rPr>
+          <w:rFonts w:ascii="Times New Roman" w:hAnsi="Times New Roman" w:cs="Times New Roman"/>
+          <w:sz w:val="24"/>
+          <w:szCs w:val="24"/>
+        </w:rPr>
+      </w:pPr>
+      <w:r>
+        <w:rPr>
+          <w:rFonts w:ascii="Times New Roman" w:hAnsi="Times New Roman" w:cs="Times New Roman"/>
+          <w:sz w:val="24"/>
+          <w:szCs w:val="24"/>
+        </w:rPr>
+        <w:t>Application</w:t>
+      </w:r>
+    </w:p>
+    <w:p>
+      <w:pPr>
         <w:pStyle w:val="Heading1"/>
         <w:keepNext w:val="0"/>
         <w:keepLines w:val="0"/>
@@ -1421,7 +4047,90 @@
           <w:sz w:val="24"/>
           <w:szCs w:val="24"/>
         </w:rPr>
-        <w:t>The result should include all the graphs, charts or other kinds of finding from your research.</w:t>
+        <w:t>T</w:t>
+      </w:r>
+      <w:r>
+        <w:rPr>
+          <w:rFonts w:ascii="Times New Roman" w:eastAsia="Times New Roman" w:hAnsi="Times New Roman" w:cs="Times New Roman"/>
+          <w:sz w:val="24"/>
+          <w:szCs w:val="24"/>
+        </w:rPr>
+        <w:t>he result of the above methods:…</w:t>
+      </w:r>
+    </w:p>
+    <w:p>
+      <w:pPr>
+        <w:spacing w:line="480" w:lineRule="auto"/>
+        <w:ind w:firstLine="720"/>
+        <w:rPr>
+          <w:rFonts w:ascii="Times New Roman" w:eastAsia="Times New Roman" w:hAnsi="Times New Roman" w:cs="Times New Roman"/>
+          <w:sz w:val="24"/>
+          <w:szCs w:val="24"/>
+        </w:rPr>
+      </w:pPr>
+      <w:r>
+        <w:rPr>
+          <w:rFonts w:ascii="Times New Roman" w:eastAsia="Times New Roman" w:hAnsi="Times New Roman" w:cs="Times New Roman"/>
+          <w:sz w:val="24"/>
+          <w:szCs w:val="24"/>
+        </w:rPr>
+        <w:t>(Include result persistent homology diagram of fire locations/fire hydrants)</w:t>
+      </w:r>
+    </w:p>
+    <w:p>
+      <w:pPr>
+        <w:spacing w:line="480" w:lineRule="auto"/>
+        <w:ind w:firstLine="720"/>
+        <w:rPr>
+          <w:rFonts w:ascii="Times New Roman" w:eastAsia="Times New Roman" w:hAnsi="Times New Roman" w:cs="Times New Roman"/>
+          <w:sz w:val="24"/>
+          <w:szCs w:val="24"/>
+        </w:rPr>
+      </w:pPr>
+      <w:r>
+        <w:rPr>
+          <w:rFonts w:ascii="Times New Roman" w:eastAsia="Times New Roman" w:hAnsi="Times New Roman" w:cs="Times New Roman"/>
+          <w:sz w:val="24"/>
+          <w:szCs w:val="24"/>
+        </w:rPr>
+        <w:t xml:space="preserve">(include the result of </w:t>
+      </w:r>
+      <w:proofErr w:type="spellStart"/>
+      <w:r>
+        <w:rPr>
+          <w:rFonts w:ascii="Times New Roman" w:eastAsia="Times New Roman" w:hAnsi="Times New Roman" w:cs="Times New Roman"/>
+          <w:sz w:val="24"/>
+          <w:szCs w:val="24"/>
+        </w:rPr>
+        <w:t>multilayerd</w:t>
+      </w:r>
+      <w:proofErr w:type="spellEnd"/>
+      <w:r>
+        <w:rPr>
+          <w:rFonts w:ascii="Times New Roman" w:eastAsia="Times New Roman" w:hAnsi="Times New Roman" w:cs="Times New Roman"/>
+          <w:sz w:val="24"/>
+          <w:szCs w:val="24"/>
+        </w:rPr>
+        <w:t xml:space="preserve"> persistent homology graphs and tables)</w:t>
+      </w:r>
+    </w:p>
+    <w:p>
+      <w:pPr>
+        <w:spacing w:line="480" w:lineRule="auto"/>
+        <w:ind w:firstLine="720"/>
+        <w:rPr>
+          <w:rFonts w:ascii="Times New Roman" w:eastAsia="Times New Roman" w:hAnsi="Times New Roman" w:cs="Times New Roman"/>
+          <w:sz w:val="24"/>
+          <w:szCs w:val="24"/>
+        </w:rPr>
+      </w:pPr>
+      <w:r>
+        <w:rPr>
+          <w:rFonts w:ascii="Times New Roman" w:eastAsia="Times New Roman" w:hAnsi="Times New Roman" w:cs="Times New Roman"/>
+          <w:sz w:val="24"/>
+          <w:szCs w:val="24"/>
+        </w:rPr>
+        <w:t>(include mapper algorithm sample network figure)</w:t>
       </w:r>
     </w:p>
     <w:p>
@@ -1465,26 +4174,88 @@
           <w:szCs w:val="24"/>
         </w:rPr>
         <w:lastRenderedPageBreak/>
-        <w:t>The discussion should be the largest part of your paper and include your argument, research, and experiences (for example, through Service-Learning). Each main point of your paper should start its own paragraph with a strong first sentence. Again, limit the use of “I” and “you” in academic writing.</w:t>
-      </w:r>
-    </w:p>
-    <w:p>
-      <w:pPr>
+        <w:t>Discuss what can be derived from the result of the coding above</w:t>
+      </w:r>
+    </w:p>
+    <w:p>
+      <w:pPr>
+        <w:pStyle w:val="ListParagraph"/>
+        <w:numPr>
+          <w:ilvl w:val="0"/>
+          <w:numId w:val="7"/>
+        </w:numPr>
         <w:spacing w:before="200" w:line="480" w:lineRule="auto"/>
-        <w:ind w:firstLine="720"/>
-        <w:rPr>
-          <w:rFonts w:ascii="Times New Roman" w:eastAsia="Times New Roman" w:hAnsi="Times New Roman" w:cs="Times New Roman"/>
-          <w:sz w:val="24"/>
-          <w:szCs w:val="24"/>
-        </w:rPr>
-      </w:pPr>
-      <w:r>
-        <w:rPr>
-          <w:rFonts w:ascii="Times New Roman" w:eastAsia="Times New Roman" w:hAnsi="Times New Roman" w:cs="Times New Roman"/>
-          <w:sz w:val="24"/>
-          <w:szCs w:val="24"/>
-        </w:rPr>
-        <w:t>.</w:t>
+        <w:rPr>
+          <w:rFonts w:ascii="Times New Roman" w:eastAsia="Times New Roman" w:hAnsi="Times New Roman" w:cs="Times New Roman"/>
+          <w:b/>
+          <w:bCs/>
+          <w:sz w:val="24"/>
+          <w:szCs w:val="24"/>
+        </w:rPr>
+      </w:pPr>
+      <w:r>
+        <w:rPr>
+          <w:rFonts w:ascii="Times New Roman" w:eastAsia="Times New Roman" w:hAnsi="Times New Roman" w:cs="Times New Roman"/>
+          <w:b/>
+          <w:bCs/>
+          <w:sz w:val="24"/>
+          <w:szCs w:val="24"/>
+        </w:rPr>
+        <w:t>Persistent Homology</w:t>
+      </w:r>
+    </w:p>
+    <w:p>
+      <w:pPr>
+        <w:pStyle w:val="ListParagraph"/>
+        <w:numPr>
+          <w:ilvl w:val="0"/>
+          <w:numId w:val="7"/>
+        </w:numPr>
+        <w:spacing w:before="200" w:line="480" w:lineRule="auto"/>
+        <w:rPr>
+          <w:rFonts w:ascii="Times New Roman" w:eastAsia="Times New Roman" w:hAnsi="Times New Roman" w:cs="Times New Roman"/>
+          <w:b/>
+          <w:bCs/>
+          <w:sz w:val="24"/>
+          <w:szCs w:val="24"/>
+        </w:rPr>
+      </w:pPr>
+      <w:r>
+        <w:rPr>
+          <w:rFonts w:ascii="Times New Roman" w:eastAsia="Times New Roman" w:hAnsi="Times New Roman" w:cs="Times New Roman"/>
+          <w:b/>
+          <w:bCs/>
+          <w:sz w:val="24"/>
+          <w:szCs w:val="24"/>
+        </w:rPr>
+        <w:t>Multi-layer Persistent Homology</w:t>
+      </w:r>
+    </w:p>
+    <w:p>
+      <w:pPr>
+        <w:pStyle w:val="ListParagraph"/>
+        <w:numPr>
+          <w:ilvl w:val="0"/>
+          <w:numId w:val="7"/>
+        </w:numPr>
+        <w:spacing w:before="200" w:line="480" w:lineRule="auto"/>
+        <w:rPr>
+          <w:rFonts w:ascii="Times New Roman" w:eastAsia="Times New Roman" w:hAnsi="Times New Roman" w:cs="Times New Roman"/>
+          <w:b/>
+          <w:bCs/>
+          <w:sz w:val="24"/>
+          <w:szCs w:val="24"/>
+        </w:rPr>
+      </w:pPr>
+      <w:r>
+        <w:rPr>
+          <w:rFonts w:ascii="Times New Roman" w:eastAsia="Times New Roman" w:hAnsi="Times New Roman" w:cs="Times New Roman"/>
+          <w:b/>
+          <w:bCs/>
+          <w:sz w:val="24"/>
+          <w:szCs w:val="24"/>
+        </w:rPr>
+        <w:t>Mapper Algorithm</w:t>
       </w:r>
     </w:p>
     <w:p>
@@ -1548,7 +4319,25 @@
           <w:sz w:val="24"/>
           <w:szCs w:val="24"/>
         </w:rPr>
-        <w:t xml:space="preserve">O'Neil, E., &amp; Tymochko, S. (2024). </w:t>
+        <w:t xml:space="preserve">O'Neil, E., &amp; </w:t>
+      </w:r>
+      <w:proofErr w:type="spellStart"/>
+      <w:r>
+        <w:rPr>
+          <w:rFonts w:ascii="Times New Roman" w:hAnsi="Times New Roman" w:cs="Times New Roman"/>
+          <w:sz w:val="24"/>
+          <w:szCs w:val="24"/>
+        </w:rPr>
+        <w:t>Tymochko</w:t>
+      </w:r>
+      <w:proofErr w:type="spellEnd"/>
+      <w:r>
+        <w:rPr>
+          <w:rFonts w:ascii="Times New Roman" w:hAnsi="Times New Roman" w:cs="Times New Roman"/>
+          <w:sz w:val="24"/>
+          <w:szCs w:val="24"/>
+        </w:rPr>
+        <w:t xml:space="preserve">, S. (2024). </w:t>
       </w:r>
       <w:r>
         <w:rPr>
@@ -1565,7 +4354,25 @@
           <w:sz w:val="24"/>
           <w:szCs w:val="24"/>
         </w:rPr>
-        <w:t xml:space="preserve">. arXiv. </w:t>
+        <w:t xml:space="preserve">. </w:t>
+      </w:r>
+      <w:proofErr w:type="spellStart"/>
+      <w:r>
+        <w:rPr>
+          <w:rFonts w:ascii="Times New Roman" w:hAnsi="Times New Roman" w:cs="Times New Roman"/>
+          <w:sz w:val="24"/>
+          <w:szCs w:val="24"/>
+        </w:rPr>
+        <w:t>arXiv</w:t>
+      </w:r>
+      <w:proofErr w:type="spellEnd"/>
+      <w:r>
+        <w:rPr>
+          <w:rFonts w:ascii="Times New Roman" w:hAnsi="Times New Roman" w:cs="Times New Roman"/>
+          <w:sz w:val="24"/>
+          <w:szCs w:val="24"/>
+        </w:rPr>
+        <w:t xml:space="preserve">. </w:t>
       </w:r>
       <w:hyperlink r:id="rId6" w:history="1">
         <w:r>
@@ -1575,25 +4382,7 @@
             <w:sz w:val="24"/>
             <w:szCs w:val="24"/>
           </w:rPr>
-          <w:t>https://arxiv.org/abs/2</w:t>
-        </w:r>
-        <w:r>
-          <w:rPr>
-            <w:rStyle w:val="Hyperlink"/>
-            <w:rFonts w:ascii="Times New Roman" w:hAnsi="Times New Roman" w:cs="Times New Roman"/>
-            <w:sz w:val="24"/>
-            <w:szCs w:val="24"/>
-          </w:rPr>
-          <w:t>4</w:t>
-        </w:r>
-        <w:r>
-          <w:rPr>
-            <w:rStyle w:val="Hyperlink"/>
-            <w:rFonts w:ascii="Times New Roman" w:hAnsi="Times New Roman" w:cs="Times New Roman"/>
-            <w:sz w:val="24"/>
-            <w:szCs w:val="24"/>
-          </w:rPr>
-          <w:t>10.09067</w:t>
+          <w:t>https://arxiv.org/abs/2410.09067</w:t>
         </w:r>
       </w:hyperlink>
     </w:p>
@@ -1785,6 +4574,95 @@
 <file path=word/numbering.xml><?xml version="1.0" encoding="utf-8"?>
 <w:numbering xmlns:wpc="http://schemas.microsoft.com/office/word/2010/wordprocessingCanvas" xmlns:cx="http://schemas.microsoft.com/office/drawing/2014/chartex" xmlns:cx1="http://schemas.microsoft.com/office/drawing/2015/9/8/chartex" xmlns:cx2="http://schemas.microsoft.com/office/drawing/2015/10/21/chartex" xmlns:cx3="http://schemas.microsoft.com/office/drawing/2016/5/9/chartex" xmlns:cx4="http://schemas.microsoft.com/office/drawing/2016/5/10/chartex" xmlns:cx5="http://schemas.microsoft.com/office/drawing/2016/5/11/chartex" xmlns:cx6="http://schemas.microsoft.com/office/drawing/2016/5/12/chartex" xmlns:cx7="http://schemas.microsoft.com/office/drawing/2016/5/13/chartex" xmlns:cx8="http://schemas.microsoft.com/office/drawing/2016/5/14/chartex" xmlns:mc="http://schemas.openxmlformats.org/markup-compatibility/2006" xmlns:aink="http://schemas.microsoft.com/office/drawing/2016/ink" xmlns:am3d="http://schemas.microsoft.com/office/drawing/2017/model3d" xmlns:o="urn:schemas-microsoft-com:office:office" xmlns:oel="http://schemas.microsoft.com/office/2019/extlst" xmlns:r="http://schemas.openxmlformats.org/officeDocument/2006/relationships" xmlns:m="http://schemas.openxmlformats.org/officeDocument/2006/math" xmlns:v="urn:schemas-microsoft-com:vml" xmlns:wp14="http://schemas.microsoft.com/office/word/2010/wordprocessingDrawing" xmlns:wp="http://schemas.openxmlformats.org/drawingml/2006/wordprocessingDrawing" xmlns:w10="urn:schemas-microsoft-com:office:word" xmlns:w="http://schemas.openxmlformats.org/wordprocessingml/2006/main" xmlns:w14="http://schemas.microsoft.com/office/word/2010/wordml" xmlns:w15="http://schemas.microsoft.com/office/word/2012/wordml" xmlns:w16cex="http://schemas.microsoft.com/office/word/2018/wordml/cex" xmlns:w16cid="http://schemas.microsoft.com/office/word/2016/wordml/cid" xmlns:w16="http://schemas.microsoft.com/office/word/2018/wordml" xmlns:w16du="http://schemas.microsoft.com/office/word/2023/wordml/word16du" xmlns:w16sdtdh="http://schemas.microsoft.com/office/word/2020/wordml/sdtdatahash" xmlns:w16sdtfl="http://schemas.microsoft.com/office/word/2024/wordml/sdtformatlock" xmlns:w16se="http://schemas.microsoft.com/office/word/2015/wordml/symex" xmlns:wpg="http://schemas.microsoft.com/office/word/2010/wordprocessingGroup" xmlns:wpi="http://schemas.microsoft.com/office/word/2010/wordprocessingInk" xmlns:wne="http://schemas.microsoft.com/office/word/2006/wordml" xmlns:wps="http://schemas.microsoft.com/office/word/2010/wordprocessingShape" mc:Ignorable="w14 w15 w16se w16cid w16 w16cex w16sdtdh w16sdtfl w16du wp14">
   <w:abstractNum w:abstractNumId="0" w15:restartNumberingAfterBreak="0">
+    <w:nsid w:val="1BEC5319"/>
+    <w:multiLevelType w:val="hybridMultilevel"/>
+    <w:tmpl w:val="5FE4301C"/>
+    <w:lvl w:ilvl="0" w:tplc="9BCC5834">
+      <w:start w:val="1"/>
+      <w:numFmt w:val="decimal"/>
+      <w:lvlText w:val="%1."/>
+      <w:lvlJc w:val="left"/>
+      <w:pPr>
+        <w:ind w:left="1080" w:hanging="360"/>
+      </w:pPr>
+      <w:rPr>
+        <w:rFonts w:hint="default"/>
+      </w:rPr>
+    </w:lvl>
+    <w:lvl w:ilvl="1" w:tplc="04090019" w:tentative="1">
+      <w:start w:val="1"/>
+      <w:numFmt w:val="lowerLetter"/>
+      <w:lvlText w:val="%2."/>
+      <w:lvlJc w:val="left"/>
+      <w:pPr>
+        <w:ind w:left="1800" w:hanging="360"/>
+      </w:pPr>
+    </w:lvl>
+    <w:lvl w:ilvl="2" w:tplc="0409001B" w:tentative="1">
+      <w:start w:val="1"/>
+      <w:numFmt w:val="lowerRoman"/>
+      <w:lvlText w:val="%3."/>
+      <w:lvlJc w:val="right"/>
+      <w:pPr>
+        <w:ind w:left="2520" w:hanging="180"/>
+      </w:pPr>
+    </w:lvl>
+    <w:lvl w:ilvl="3" w:tplc="0409000F" w:tentative="1">
+      <w:start w:val="1"/>
+      <w:numFmt w:val="decimal"/>
+      <w:lvlText w:val="%4."/>
+      <w:lvlJc w:val="left"/>
+      <w:pPr>
+        <w:ind w:left="3240" w:hanging="360"/>
+      </w:pPr>
+    </w:lvl>
+    <w:lvl w:ilvl="4" w:tplc="04090019" w:tentative="1">
+      <w:start w:val="1"/>
+      <w:numFmt w:val="lowerLetter"/>
+      <w:lvlText w:val="%5."/>
+      <w:lvlJc w:val="left"/>
+      <w:pPr>
+        <w:ind w:left="3960" w:hanging="360"/>
+      </w:pPr>
+    </w:lvl>
+    <w:lvl w:ilvl="5" w:tplc="0409001B" w:tentative="1">
+      <w:start w:val="1"/>
+      <w:numFmt w:val="lowerRoman"/>
+      <w:lvlText w:val="%6."/>
+      <w:lvlJc w:val="right"/>
+      <w:pPr>
+        <w:ind w:left="4680" w:hanging="180"/>
+      </w:pPr>
+    </w:lvl>
+    <w:lvl w:ilvl="6" w:tplc="0409000F" w:tentative="1">
+      <w:start w:val="1"/>
+      <w:numFmt w:val="decimal"/>
+      <w:lvlText w:val="%7."/>
+      <w:lvlJc w:val="left"/>
+      <w:pPr>
+        <w:ind w:left="5400" w:hanging="360"/>
+      </w:pPr>
+    </w:lvl>
+    <w:lvl w:ilvl="7" w:tplc="04090019" w:tentative="1">
+      <w:start w:val="1"/>
+      <w:numFmt w:val="lowerLetter"/>
+      <w:lvlText w:val="%8."/>
+      <w:lvlJc w:val="left"/>
+      <w:pPr>
+        <w:ind w:left="6120" w:hanging="360"/>
+      </w:pPr>
+    </w:lvl>
+    <w:lvl w:ilvl="8" w:tplc="0409001B" w:tentative="1">
+      <w:start w:val="1"/>
+      <w:numFmt w:val="lowerRoman"/>
+      <w:lvlText w:val="%9."/>
+      <w:lvlJc w:val="right"/>
+      <w:pPr>
+        <w:ind w:left="6840" w:hanging="180"/>
+      </w:pPr>
+    </w:lvl>
+  </w:abstractNum>
+  <w:abstractNum w:abstractNumId="1" w15:restartNumberingAfterBreak="0">
     <w:nsid w:val="259C0801"/>
     <w:multiLevelType w:val="hybridMultilevel"/>
     <w:tmpl w:val="379A6876"/>
@@ -1873,7 +4751,7 @@
       </w:pPr>
     </w:lvl>
   </w:abstractNum>
-  <w:abstractNum w:abstractNumId="1" w15:restartNumberingAfterBreak="0">
+  <w:abstractNum w:abstractNumId="2" w15:restartNumberingAfterBreak="0">
     <w:nsid w:val="28835156"/>
     <w:multiLevelType w:val="hybridMultilevel"/>
     <w:tmpl w:val="D4E60768"/>
@@ -1963,7 +4841,7 @@
       </w:pPr>
     </w:lvl>
   </w:abstractNum>
-  <w:abstractNum w:abstractNumId="2" w15:restartNumberingAfterBreak="0">
+  <w:abstractNum w:abstractNumId="3" w15:restartNumberingAfterBreak="0">
     <w:nsid w:val="2A1776FC"/>
     <w:multiLevelType w:val="hybridMultilevel"/>
     <w:tmpl w:val="858602B2"/>
@@ -2052,7 +4930,7 @@
       </w:pPr>
     </w:lvl>
   </w:abstractNum>
-  <w:abstractNum w:abstractNumId="3" w15:restartNumberingAfterBreak="0">
+  <w:abstractNum w:abstractNumId="4" w15:restartNumberingAfterBreak="0">
     <w:nsid w:val="2B6737E2"/>
     <w:multiLevelType w:val="hybridMultilevel"/>
     <w:tmpl w:val="75BAD448"/>
@@ -2141,17 +5019,296 @@
       </w:pPr>
     </w:lvl>
   </w:abstractNum>
+  <w:abstractNum w:abstractNumId="5" w15:restartNumberingAfterBreak="0">
+    <w:nsid w:val="466A0998"/>
+    <w:multiLevelType w:val="hybridMultilevel"/>
+    <w:tmpl w:val="B3C8A9C0"/>
+    <w:lvl w:ilvl="0" w:tplc="ACB651C6">
+      <w:start w:val="1"/>
+      <w:numFmt w:val="upperLetter"/>
+      <w:lvlText w:val="%1."/>
+      <w:lvlJc w:val="left"/>
+      <w:pPr>
+        <w:ind w:left="1080" w:hanging="360"/>
+      </w:pPr>
+      <w:rPr>
+        <w:rFonts w:hint="default"/>
+      </w:rPr>
+    </w:lvl>
+    <w:lvl w:ilvl="1" w:tplc="04090019" w:tentative="1">
+      <w:start w:val="1"/>
+      <w:numFmt w:val="lowerLetter"/>
+      <w:lvlText w:val="%2."/>
+      <w:lvlJc w:val="left"/>
+      <w:pPr>
+        <w:ind w:left="1800" w:hanging="360"/>
+      </w:pPr>
+    </w:lvl>
+    <w:lvl w:ilvl="2" w:tplc="0409001B" w:tentative="1">
+      <w:start w:val="1"/>
+      <w:numFmt w:val="lowerRoman"/>
+      <w:lvlText w:val="%3."/>
+      <w:lvlJc w:val="right"/>
+      <w:pPr>
+        <w:ind w:left="2520" w:hanging="180"/>
+      </w:pPr>
+    </w:lvl>
+    <w:lvl w:ilvl="3" w:tplc="0409000F" w:tentative="1">
+      <w:start w:val="1"/>
+      <w:numFmt w:val="decimal"/>
+      <w:lvlText w:val="%4."/>
+      <w:lvlJc w:val="left"/>
+      <w:pPr>
+        <w:ind w:left="3240" w:hanging="360"/>
+      </w:pPr>
+    </w:lvl>
+    <w:lvl w:ilvl="4" w:tplc="04090019" w:tentative="1">
+      <w:start w:val="1"/>
+      <w:numFmt w:val="lowerLetter"/>
+      <w:lvlText w:val="%5."/>
+      <w:lvlJc w:val="left"/>
+      <w:pPr>
+        <w:ind w:left="3960" w:hanging="360"/>
+      </w:pPr>
+    </w:lvl>
+    <w:lvl w:ilvl="5" w:tplc="0409001B" w:tentative="1">
+      <w:start w:val="1"/>
+      <w:numFmt w:val="lowerRoman"/>
+      <w:lvlText w:val="%6."/>
+      <w:lvlJc w:val="right"/>
+      <w:pPr>
+        <w:ind w:left="4680" w:hanging="180"/>
+      </w:pPr>
+    </w:lvl>
+    <w:lvl w:ilvl="6" w:tplc="0409000F" w:tentative="1">
+      <w:start w:val="1"/>
+      <w:numFmt w:val="decimal"/>
+      <w:lvlText w:val="%7."/>
+      <w:lvlJc w:val="left"/>
+      <w:pPr>
+        <w:ind w:left="5400" w:hanging="360"/>
+      </w:pPr>
+    </w:lvl>
+    <w:lvl w:ilvl="7" w:tplc="04090019" w:tentative="1">
+      <w:start w:val="1"/>
+      <w:numFmt w:val="lowerLetter"/>
+      <w:lvlText w:val="%8."/>
+      <w:lvlJc w:val="left"/>
+      <w:pPr>
+        <w:ind w:left="6120" w:hanging="360"/>
+      </w:pPr>
+    </w:lvl>
+    <w:lvl w:ilvl="8" w:tplc="0409001B" w:tentative="1">
+      <w:start w:val="1"/>
+      <w:numFmt w:val="lowerRoman"/>
+      <w:lvlText w:val="%9."/>
+      <w:lvlJc w:val="right"/>
+      <w:pPr>
+        <w:ind w:left="6840" w:hanging="180"/>
+      </w:pPr>
+    </w:lvl>
+  </w:abstractNum>
+  <w:abstractNum w:abstractNumId="6" w15:restartNumberingAfterBreak="0">
+    <w:nsid w:val="4A113500"/>
+    <w:multiLevelType w:val="hybridMultilevel"/>
+    <w:tmpl w:val="97EE1578"/>
+    <w:lvl w:ilvl="0" w:tplc="8B7CAE06">
+      <w:start w:val="1"/>
+      <w:numFmt w:val="lowerLetter"/>
+      <w:lvlText w:val="%1)"/>
+      <w:lvlJc w:val="left"/>
+      <w:pPr>
+        <w:ind w:left="1440" w:hanging="360"/>
+      </w:pPr>
+      <w:rPr>
+        <w:rFonts w:hint="default"/>
+      </w:rPr>
+    </w:lvl>
+    <w:lvl w:ilvl="1" w:tplc="04090019" w:tentative="1">
+      <w:start w:val="1"/>
+      <w:numFmt w:val="lowerLetter"/>
+      <w:lvlText w:val="%2."/>
+      <w:lvlJc w:val="left"/>
+      <w:pPr>
+        <w:ind w:left="2160" w:hanging="360"/>
+      </w:pPr>
+    </w:lvl>
+    <w:lvl w:ilvl="2" w:tplc="0409001B" w:tentative="1">
+      <w:start w:val="1"/>
+      <w:numFmt w:val="lowerRoman"/>
+      <w:lvlText w:val="%3."/>
+      <w:lvlJc w:val="right"/>
+      <w:pPr>
+        <w:ind w:left="2880" w:hanging="180"/>
+      </w:pPr>
+    </w:lvl>
+    <w:lvl w:ilvl="3" w:tplc="0409000F" w:tentative="1">
+      <w:start w:val="1"/>
+      <w:numFmt w:val="decimal"/>
+      <w:lvlText w:val="%4."/>
+      <w:lvlJc w:val="left"/>
+      <w:pPr>
+        <w:ind w:left="3600" w:hanging="360"/>
+      </w:pPr>
+    </w:lvl>
+    <w:lvl w:ilvl="4" w:tplc="04090019" w:tentative="1">
+      <w:start w:val="1"/>
+      <w:numFmt w:val="lowerLetter"/>
+      <w:lvlText w:val="%5."/>
+      <w:lvlJc w:val="left"/>
+      <w:pPr>
+        <w:ind w:left="4320" w:hanging="360"/>
+      </w:pPr>
+    </w:lvl>
+    <w:lvl w:ilvl="5" w:tplc="0409001B" w:tentative="1">
+      <w:start w:val="1"/>
+      <w:numFmt w:val="lowerRoman"/>
+      <w:lvlText w:val="%6."/>
+      <w:lvlJc w:val="right"/>
+      <w:pPr>
+        <w:ind w:left="5040" w:hanging="180"/>
+      </w:pPr>
+    </w:lvl>
+    <w:lvl w:ilvl="6" w:tplc="0409000F" w:tentative="1">
+      <w:start w:val="1"/>
+      <w:numFmt w:val="decimal"/>
+      <w:lvlText w:val="%7."/>
+      <w:lvlJc w:val="left"/>
+      <w:pPr>
+        <w:ind w:left="5760" w:hanging="360"/>
+      </w:pPr>
+    </w:lvl>
+    <w:lvl w:ilvl="7" w:tplc="04090019" w:tentative="1">
+      <w:start w:val="1"/>
+      <w:numFmt w:val="lowerLetter"/>
+      <w:lvlText w:val="%8."/>
+      <w:lvlJc w:val="left"/>
+      <w:pPr>
+        <w:ind w:left="6480" w:hanging="360"/>
+      </w:pPr>
+    </w:lvl>
+    <w:lvl w:ilvl="8" w:tplc="0409001B" w:tentative="1">
+      <w:start w:val="1"/>
+      <w:numFmt w:val="lowerRoman"/>
+      <w:lvlText w:val="%9."/>
+      <w:lvlJc w:val="right"/>
+      <w:pPr>
+        <w:ind w:left="7200" w:hanging="180"/>
+      </w:pPr>
+    </w:lvl>
+  </w:abstractNum>
+  <w:abstractNum w:abstractNumId="7" w15:restartNumberingAfterBreak="0">
+    <w:nsid w:val="6D620B49"/>
+    <w:multiLevelType w:val="hybridMultilevel"/>
+    <w:tmpl w:val="9C7265B2"/>
+    <w:lvl w:ilvl="0" w:tplc="F13C212A">
+      <w:start w:val="1"/>
+      <w:numFmt w:val="decimal"/>
+      <w:lvlText w:val="%1."/>
+      <w:lvlJc w:val="left"/>
+      <w:pPr>
+        <w:ind w:left="1080" w:hanging="360"/>
+      </w:pPr>
+      <w:rPr>
+        <w:rFonts w:hint="default"/>
+      </w:rPr>
+    </w:lvl>
+    <w:lvl w:ilvl="1" w:tplc="04090019" w:tentative="1">
+      <w:start w:val="1"/>
+      <w:numFmt w:val="lowerLetter"/>
+      <w:lvlText w:val="%2."/>
+      <w:lvlJc w:val="left"/>
+      <w:pPr>
+        <w:ind w:left="1800" w:hanging="360"/>
+      </w:pPr>
+    </w:lvl>
+    <w:lvl w:ilvl="2" w:tplc="0409001B" w:tentative="1">
+      <w:start w:val="1"/>
+      <w:numFmt w:val="lowerRoman"/>
+      <w:lvlText w:val="%3."/>
+      <w:lvlJc w:val="right"/>
+      <w:pPr>
+        <w:ind w:left="2520" w:hanging="180"/>
+      </w:pPr>
+    </w:lvl>
+    <w:lvl w:ilvl="3" w:tplc="0409000F" w:tentative="1">
+      <w:start w:val="1"/>
+      <w:numFmt w:val="decimal"/>
+      <w:lvlText w:val="%4."/>
+      <w:lvlJc w:val="left"/>
+      <w:pPr>
+        <w:ind w:left="3240" w:hanging="360"/>
+      </w:pPr>
+    </w:lvl>
+    <w:lvl w:ilvl="4" w:tplc="04090019" w:tentative="1">
+      <w:start w:val="1"/>
+      <w:numFmt w:val="lowerLetter"/>
+      <w:lvlText w:val="%5."/>
+      <w:lvlJc w:val="left"/>
+      <w:pPr>
+        <w:ind w:left="3960" w:hanging="360"/>
+      </w:pPr>
+    </w:lvl>
+    <w:lvl w:ilvl="5" w:tplc="0409001B" w:tentative="1">
+      <w:start w:val="1"/>
+      <w:numFmt w:val="lowerRoman"/>
+      <w:lvlText w:val="%6."/>
+      <w:lvlJc w:val="right"/>
+      <w:pPr>
+        <w:ind w:left="4680" w:hanging="180"/>
+      </w:pPr>
+    </w:lvl>
+    <w:lvl w:ilvl="6" w:tplc="0409000F" w:tentative="1">
+      <w:start w:val="1"/>
+      <w:numFmt w:val="decimal"/>
+      <w:lvlText w:val="%7."/>
+      <w:lvlJc w:val="left"/>
+      <w:pPr>
+        <w:ind w:left="5400" w:hanging="360"/>
+      </w:pPr>
+    </w:lvl>
+    <w:lvl w:ilvl="7" w:tplc="04090019" w:tentative="1">
+      <w:start w:val="1"/>
+      <w:numFmt w:val="lowerLetter"/>
+      <w:lvlText w:val="%8."/>
+      <w:lvlJc w:val="left"/>
+      <w:pPr>
+        <w:ind w:left="6120" w:hanging="360"/>
+      </w:pPr>
+    </w:lvl>
+    <w:lvl w:ilvl="8" w:tplc="0409001B" w:tentative="1">
+      <w:start w:val="1"/>
+      <w:numFmt w:val="lowerRoman"/>
+      <w:lvlText w:val="%9."/>
+      <w:lvlJc w:val="right"/>
+      <w:pPr>
+        <w:ind w:left="6840" w:hanging="180"/>
+      </w:pPr>
+    </w:lvl>
+  </w:abstractNum>
   <w:num w:numId="1" w16cid:durableId="401177768">
+    <w:abstractNumId w:val="1"/>
+  </w:num>
+  <w:num w:numId="2" w16cid:durableId="1081558797">
+    <w:abstractNumId w:val="2"/>
+  </w:num>
+  <w:num w:numId="3" w16cid:durableId="1623882585">
+    <w:abstractNumId w:val="4"/>
+  </w:num>
+  <w:num w:numId="4" w16cid:durableId="818570690">
+    <w:abstractNumId w:val="3"/>
+  </w:num>
+  <w:num w:numId="5" w16cid:durableId="1170099840">
     <w:abstractNumId w:val="0"/>
   </w:num>
-  <w:num w:numId="2" w16cid:durableId="1081558797">
-    <w:abstractNumId w:val="1"/>
+  <w:num w:numId="6" w16cid:durableId="1559851974">
+    <w:abstractNumId w:val="6"/>
   </w:num>
-  <w:num w:numId="3" w16cid:durableId="1623882585">
-    <w:abstractNumId w:val="3"/>
+  <w:num w:numId="7" w16cid:durableId="1386415999">
+    <w:abstractNumId w:val="5"/>
   </w:num>
-  <w:num w:numId="4" w16cid:durableId="818570690">
-    <w:abstractNumId w:val="2"/>
+  <w:num w:numId="8" w16cid:durableId="1290207691">
+    <w:abstractNumId w:val="7"/>
   </w:num>
 </w:numbering>
 </file>
@@ -2810,6 +5967,37 @@
       <w:lang w:val="en-US"/>
     </w:rPr>
   </w:style>
+  <w:style w:type="character" w:styleId="Strong">
+    <w:name w:val="Strong"/>
+    <w:basedOn w:val="DefaultParagraphFont"/>
+    <w:uiPriority w:val="22"/>
+    <w:qFormat/>
+    <w:rsid w:val="00E32FA6"/>
+    <w:rPr>
+      <w:b/>
+      <w:bCs/>
+    </w:rPr>
+  </w:style>
+  <w:style w:type="character" w:customStyle="1" w:styleId="mord">
+    <w:name w:val="mord"/>
+    <w:basedOn w:val="DefaultParagraphFont"/>
+    <w:rsid w:val="00E32FA6"/>
+  </w:style>
+  <w:style w:type="character" w:customStyle="1" w:styleId="mrel">
+    <w:name w:val="mrel"/>
+    <w:basedOn w:val="DefaultParagraphFont"/>
+    <w:rsid w:val="00E32FA6"/>
+  </w:style>
+  <w:style w:type="character" w:customStyle="1" w:styleId="vlist-s">
+    <w:name w:val="vlist-s"/>
+    <w:basedOn w:val="DefaultParagraphFont"/>
+    <w:rsid w:val="00E32FA6"/>
+  </w:style>
+  <w:style w:type="character" w:customStyle="1" w:styleId="minner">
+    <w:name w:val="minner"/>
+    <w:basedOn w:val="DefaultParagraphFont"/>
+    <w:rsid w:val="00E32FA6"/>
+  </w:style>
 </w:styles>
 </file>
 

</xml_diff>